<commit_message>
finish act3, whole lab 01. and main contains questions and in-lab contains the answers
</commit_message>
<xml_diff>
--- a/IT25102813-lab-01.docx
+++ b/IT25102813-lab-01.docx
@@ -39,33 +39,714 @@
         <w:spacing/>
         <w:ind/>
         <w:rPr>
-          <w:highlight w:val="none"/>
-        </w:rPr>
-      </w:pPr>
-      <w:r>
-        <w:rPr>
+          <w:b/>
+          <w:bCs/>
+          <w:sz w:val="28"/>
+          <w:szCs w:val="28"/>
+          <w:highlight w:val="none"/>
+        </w:rPr>
+      </w:pPr>
+      <w:r>
+        <w:rPr>
+          <w:b/>
+          <w:bCs/>
+          <w:sz w:val="28"/>
+          <w:szCs w:val="28"/>
           <w:highlight w:val="none"/>
         </w:rPr>
         <w:t xml:space="preserve">Exercise 1</w:t>
       </w:r>
-      <w:r/>
-    </w:p>
-    <w:p>
-      <w:pPr>
-        <w:pBdr/>
-        <w:spacing/>
-        <w:ind/>
-        <w:rPr>
-          <w:highlight w:val="none"/>
-        </w:rPr>
-      </w:pPr>
-      <w:r>
-        <w:rPr>
+      <w:r>
+        <w:rPr>
+          <w:b/>
+          <w:bCs/>
+          <w:sz w:val="28"/>
+          <w:szCs w:val="28"/>
+          <w:highlight w:val="none"/>
+        </w:rPr>
+      </w:r>
+    </w:p>
+    <w:p>
+      <w:pPr>
+        <w:pBdr/>
+        <w:spacing/>
+        <w:ind/>
+        <w:rPr/>
+      </w:pPr>
+      <w:r>
+        <w:rPr>
+          <w:b w:val="0"/>
+          <w:bCs w:val="0"/>
+          <w:sz w:val="22"/>
+          <w:szCs w:val="22"/>
+          <w:highlight w:val="none"/>
+        </w:rPr>
+        <w:t xml:space="preserve">import java.util.Scanner;</w:t>
+      </w:r>
+      <w:r/>
+    </w:p>
+    <w:p>
+      <w:pPr>
+        <w:pBdr/>
+        <w:spacing/>
+        <w:ind/>
+        <w:rPr/>
+      </w:pPr>
+      <w:r>
+        <w:rPr>
+          <w:b w:val="0"/>
+          <w:bCs w:val="0"/>
+          <w:sz w:val="22"/>
+          <w:szCs w:val="22"/>
+          <w:highlight w:val="none"/>
+        </w:rPr>
+      </w:r>
+      <w:r/>
+    </w:p>
+    <w:p>
+      <w:pPr>
+        <w:pBdr/>
+        <w:spacing/>
+        <w:ind/>
+        <w:rPr/>
+      </w:pPr>
+      <w:r>
+        <w:rPr>
+          <w:b w:val="0"/>
+          <w:bCs w:val="0"/>
+          <w:sz w:val="22"/>
+          <w:szCs w:val="22"/>
+          <w:highlight w:val="none"/>
+        </w:rPr>
+        <w:t xml:space="preserve">public class Welcome{</w:t>
+      </w:r>
+      <w:r/>
+    </w:p>
+    <w:p>
+      <w:pPr>
+        <w:pBdr/>
+        <w:spacing/>
+        <w:ind/>
+        <w:rPr/>
+      </w:pPr>
+      <w:r>
+        <w:rPr>
+          <w:b w:val="0"/>
+          <w:bCs w:val="0"/>
+          <w:sz w:val="22"/>
+          <w:szCs w:val="22"/>
+          <w:highlight w:val="none"/>
+        </w:rPr>
+        <w:t xml:space="preserve">        public static void main(String[] args){</w:t>
+      </w:r>
+      <w:r/>
+    </w:p>
+    <w:p>
+      <w:pPr>
+        <w:pBdr/>
+        <w:spacing/>
+        <w:ind/>
+        <w:rPr/>
+      </w:pPr>
+      <w:r>
+        <w:rPr>
+          <w:b w:val="0"/>
+          <w:bCs w:val="0"/>
+          <w:sz w:val="22"/>
+          <w:szCs w:val="22"/>
+          <w:highlight w:val="none"/>
+        </w:rPr>
+        <w:t xml:space="preserve">        Scanner scanner = new Scanner(System.in);</w:t>
+      </w:r>
+      <w:r/>
+    </w:p>
+    <w:p>
+      <w:pPr>
+        <w:pBdr/>
+        <w:spacing/>
+        <w:ind/>
+        <w:rPr/>
+      </w:pPr>
+      <w:r>
+        <w:rPr>
+          <w:b w:val="0"/>
+          <w:bCs w:val="0"/>
+          <w:sz w:val="22"/>
+          <w:szCs w:val="22"/>
+          <w:highlight w:val="none"/>
+        </w:rPr>
+      </w:r>
+      <w:r/>
+    </w:p>
+    <w:p>
+      <w:pPr>
+        <w:pBdr/>
+        <w:spacing/>
+        <w:ind/>
+        <w:rPr/>
+      </w:pPr>
+      <w:r>
+        <w:rPr>
+          <w:b w:val="0"/>
+          <w:bCs w:val="0"/>
+          <w:sz w:val="22"/>
+          <w:szCs w:val="22"/>
+          <w:highlight w:val="none"/>
+        </w:rPr>
+        <w:t xml:space="preserve">        //Getting input - first name</w:t>
+      </w:r>
+      <w:r/>
+    </w:p>
+    <w:p>
+      <w:pPr>
+        <w:pBdr/>
+        <w:spacing/>
+        <w:ind/>
+        <w:rPr/>
+      </w:pPr>
+      <w:r>
+        <w:rPr>
+          <w:b w:val="0"/>
+          <w:bCs w:val="0"/>
+          <w:sz w:val="22"/>
+          <w:szCs w:val="22"/>
+          <w:highlight w:val="none"/>
+        </w:rPr>
+        <w:t xml:space="preserve">        System.out.print("Enter your first name ");</w:t>
+      </w:r>
+      <w:r/>
+    </w:p>
+    <w:p>
+      <w:pPr>
+        <w:pBdr/>
+        <w:spacing/>
+        <w:ind/>
+        <w:rPr/>
+      </w:pPr>
+      <w:r>
+        <w:rPr>
+          <w:b w:val="0"/>
+          <w:bCs w:val="0"/>
+          <w:sz w:val="22"/>
+          <w:szCs w:val="22"/>
+          <w:highlight w:val="none"/>
+        </w:rPr>
+        <w:t xml:space="preserve">        String f_name = scanner.nextLine();</w:t>
+      </w:r>
+      <w:r/>
+    </w:p>
+    <w:p>
+      <w:pPr>
+        <w:pBdr/>
+        <w:spacing/>
+        <w:ind/>
+        <w:rPr/>
+      </w:pPr>
+      <w:r>
+        <w:rPr>
+          <w:b w:val="0"/>
+          <w:bCs w:val="0"/>
+          <w:sz w:val="22"/>
+          <w:szCs w:val="22"/>
+          <w:highlight w:val="none"/>
+        </w:rPr>
+      </w:r>
+      <w:r/>
+    </w:p>
+    <w:p>
+      <w:pPr>
+        <w:pBdr/>
+        <w:spacing/>
+        <w:ind/>
+        <w:rPr/>
+      </w:pPr>
+      <w:r>
+        <w:rPr>
+          <w:b w:val="0"/>
+          <w:bCs w:val="0"/>
+          <w:sz w:val="22"/>
+          <w:szCs w:val="22"/>
+          <w:highlight w:val="none"/>
+        </w:rPr>
+        <w:t xml:space="preserve">        //Getting input - last name</w:t>
+      </w:r>
+      <w:r/>
+    </w:p>
+    <w:p>
+      <w:pPr>
+        <w:pBdr/>
+        <w:spacing/>
+        <w:ind/>
+        <w:rPr/>
+      </w:pPr>
+      <w:r>
+        <w:rPr>
+          <w:b w:val="0"/>
+          <w:bCs w:val="0"/>
+          <w:sz w:val="22"/>
+          <w:szCs w:val="22"/>
+          <w:highlight w:val="none"/>
+        </w:rPr>
+        <w:t xml:space="preserve">        System.out.print("Enter your last name ");</w:t>
+      </w:r>
+      <w:r/>
+    </w:p>
+    <w:p>
+      <w:pPr>
+        <w:pBdr/>
+        <w:spacing/>
+        <w:ind/>
+        <w:rPr/>
+      </w:pPr>
+      <w:r>
+        <w:rPr>
+          <w:b w:val="0"/>
+          <w:bCs w:val="0"/>
+          <w:sz w:val="22"/>
+          <w:szCs w:val="22"/>
+          <w:highlight w:val="none"/>
+        </w:rPr>
+        <w:t xml:space="preserve">        String l_name = scanner.nextLine();</w:t>
+      </w:r>
+      <w:r/>
+    </w:p>
+    <w:p>
+      <w:pPr>
+        <w:pBdr/>
+        <w:spacing/>
+        <w:ind/>
+        <w:rPr/>
+      </w:pPr>
+      <w:r>
+        <w:rPr>
+          <w:b w:val="0"/>
+          <w:bCs w:val="0"/>
+          <w:sz w:val="22"/>
+          <w:szCs w:val="22"/>
+          <w:highlight w:val="none"/>
+        </w:rPr>
+      </w:r>
+      <w:r/>
+    </w:p>
+    <w:p>
+      <w:pPr>
+        <w:pBdr/>
+        <w:spacing/>
+        <w:ind/>
+        <w:rPr/>
+      </w:pPr>
+      <w:r>
+        <w:rPr>
+          <w:b w:val="0"/>
+          <w:bCs w:val="0"/>
+          <w:sz w:val="22"/>
+          <w:szCs w:val="22"/>
+          <w:highlight w:val="none"/>
+        </w:rPr>
+        <w:t xml:space="preserve">        //printing output</w:t>
+      </w:r>
+      <w:r/>
+    </w:p>
+    <w:p>
+      <w:pPr>
+        <w:pBdr/>
+        <w:spacing/>
+        <w:ind/>
+        <w:rPr/>
+      </w:pPr>
+      <w:r>
+        <w:rPr>
+          <w:b w:val="0"/>
+          <w:bCs w:val="0"/>
+          <w:sz w:val="22"/>
+          <w:szCs w:val="22"/>
+          <w:highlight w:val="none"/>
+        </w:rPr>
+        <w:t xml:space="preserve">        System.out.printf("Welcome to Second Year %s %s\n", f_name, l_name);</w:t>
+      </w:r>
+      <w:r/>
+    </w:p>
+    <w:p>
+      <w:pPr>
+        <w:pBdr/>
+        <w:spacing/>
+        <w:ind/>
+        <w:rPr/>
+      </w:pPr>
+      <w:r>
+        <w:rPr>
+          <w:b w:val="0"/>
+          <w:bCs w:val="0"/>
+          <w:sz w:val="22"/>
+          <w:szCs w:val="22"/>
+          <w:highlight w:val="none"/>
+        </w:rPr>
+        <w:t xml:space="preserve">        scanner.close();</w:t>
+      </w:r>
+      <w:r/>
+    </w:p>
+    <w:p>
+      <w:pPr>
+        <w:pBdr/>
+        <w:spacing/>
+        <w:ind/>
+        <w:rPr/>
+      </w:pPr>
+      <w:r>
+        <w:rPr>
+          <w:b w:val="0"/>
+          <w:bCs w:val="0"/>
+          <w:sz w:val="22"/>
+          <w:szCs w:val="22"/>
+          <w:highlight w:val="none"/>
+        </w:rPr>
+        <w:t xml:space="preserve">        }</w:t>
+      </w:r>
+      <w:r/>
+    </w:p>
+    <w:p>
+      <w:pPr>
+        <w:pBdr/>
+        <w:spacing/>
+        <w:ind/>
+        <w:rPr>
+          <w:b w:val="0"/>
+          <w:bCs w:val="0"/>
+          <w:sz w:val="22"/>
+          <w:szCs w:val="22"/>
+          <w:highlight w:val="none"/>
+        </w:rPr>
+      </w:pPr>
+      <w:r>
+        <w:rPr>
+          <w:b w:val="0"/>
+          <w:bCs w:val="0"/>
+          <w:sz w:val="22"/>
+          <w:szCs w:val="22"/>
+          <w:highlight w:val="none"/>
+        </w:rPr>
+        <w:t xml:space="preserve">}</w:t>
+      </w:r>
+      <w:r/>
+      <w:r>
+        <w:rPr>
+          <w:b w:val="0"/>
+          <w:bCs w:val="0"/>
+          <w:sz w:val="22"/>
+          <w:szCs w:val="22"/>
+          <w:highlight w:val="none"/>
+        </w:rPr>
+      </w:r>
+      <w:r>
+        <w:rPr>
+          <w:b/>
+          <w:bCs/>
+          <w:sz w:val="28"/>
+          <w:szCs w:val="28"/>
+          <w:highlight w:val="none"/>
+        </w:rPr>
+      </w:r>
+      <w:r>
+        <w:rPr>
+          <w:b w:val="0"/>
+          <w:bCs w:val="0"/>
+          <w:sz w:val="22"/>
+          <w:szCs w:val="22"/>
+          <w:highlight w:val="none"/>
+        </w:rPr>
+      </w:r>
+    </w:p>
+    <w:p>
+      <w:pPr>
+        <w:pBdr/>
+        <w:spacing/>
+        <w:ind/>
+        <w:rPr>
+          <w:b/>
+          <w:bCs/>
+          <w:sz w:val="28"/>
+          <w:szCs w:val="28"/>
+          <w:highlight w:val="none"/>
+        </w:rPr>
+      </w:pPr>
+      <w:r>
+        <w:rPr>
+          <w:b/>
+          <w:bCs/>
+          <w:sz w:val="28"/>
+          <w:szCs w:val="28"/>
+          <w:highlight w:val="none"/>
+        </w:rPr>
+        <w:t xml:space="preserve">Output</w:t>
+      </w:r>
+      <w:r>
+        <w:rPr>
+          <w:b/>
+          <w:bCs/>
+          <w:sz w:val="28"/>
+          <w:szCs w:val="28"/>
+          <w:highlight w:val="none"/>
+        </w:rPr>
+      </w:r>
+    </w:p>
+    <w:p>
+      <w:pPr>
+        <w:pBdr/>
+        <w:spacing/>
+        <w:ind/>
+        <w:rPr>
+          <w:b w:val="0"/>
+          <w:bCs w:val="0"/>
+          <w:sz w:val="22"/>
+          <w:szCs w:val="22"/>
+        </w:rPr>
+      </w:pPr>
+      <w:r>
+        <w:rPr>
+          <w:b w:val="0"/>
+          <w:bCs w:val="0"/>
+          <w:sz w:val="22"/>
+          <w:szCs w:val="22"/>
+          <w:highlight w:val="none"/>
+        </w:rPr>
+        <w:t xml:space="preserve">Enter your first name Abivarsan</w:t>
+      </w:r>
+      <w:r>
+        <w:rPr>
+          <w:b w:val="0"/>
+          <w:bCs w:val="0"/>
+          <w:sz w:val="18"/>
+          <w:szCs w:val="18"/>
+        </w:rPr>
+      </w:r>
+    </w:p>
+    <w:p>
+      <w:pPr>
+        <w:pBdr/>
+        <w:spacing/>
+        <w:ind/>
+        <w:rPr>
+          <w:b w:val="0"/>
+          <w:bCs w:val="0"/>
+          <w:sz w:val="22"/>
+          <w:szCs w:val="22"/>
+        </w:rPr>
+      </w:pPr>
+      <w:r>
+        <w:rPr>
+          <w:b w:val="0"/>
+          <w:bCs w:val="0"/>
+          <w:sz w:val="22"/>
+          <w:szCs w:val="22"/>
+          <w:highlight w:val="none"/>
+        </w:rPr>
+        <w:t xml:space="preserve">Enter your last name Yogeswaran</w:t>
+      </w:r>
+      <w:r>
+        <w:rPr>
+          <w:b w:val="0"/>
+          <w:bCs w:val="0"/>
+          <w:sz w:val="18"/>
+          <w:szCs w:val="18"/>
+        </w:rPr>
+      </w:r>
+    </w:p>
+    <w:p>
+      <w:pPr>
+        <w:pBdr/>
+        <w:spacing/>
+        <w:ind/>
+        <w:rPr>
+          <w:b w:val="0"/>
+          <w:bCs w:val="0"/>
+          <w:sz w:val="22"/>
+          <w:szCs w:val="22"/>
+          <w:highlight w:val="none"/>
+        </w:rPr>
+      </w:pPr>
+      <w:r>
+        <w:rPr>
+          <w:b w:val="0"/>
+          <w:bCs w:val="0"/>
+          <w:sz w:val="22"/>
+          <w:szCs w:val="22"/>
+          <w:highlight w:val="none"/>
+        </w:rPr>
+        <w:t xml:space="preserve">Welcome to Second Year Abivarsan Yogeswaran</w:t>
+      </w:r>
+      <w:r>
+        <w:rPr>
+          <w:b w:val="0"/>
+          <w:bCs w:val="0"/>
+          <w:sz w:val="22"/>
+          <w:szCs w:val="22"/>
+          <w:highlight w:val="none"/>
+        </w:rPr>
+      </w:r>
+      <w:r>
+        <w:rPr>
+          <w:b w:val="0"/>
+          <w:bCs w:val="0"/>
+          <w:sz w:val="22"/>
+          <w:szCs w:val="22"/>
+          <w:highlight w:val="none"/>
+        </w:rPr>
+      </w:r>
+    </w:p>
+    <w:p>
+      <w:pPr>
+        <w:pBdr/>
+        <w:spacing/>
+        <w:ind/>
+        <w:rPr>
+          <w:b/>
+          <w:bCs/>
+          <w:sz w:val="28"/>
+          <w:szCs w:val="28"/>
+          <w:highlight w:val="none"/>
+        </w:rPr>
+      </w:pPr>
+      <w:r>
+        <w:rPr>
+          <w:b/>
+          <w:bCs/>
+          <w:sz w:val="28"/>
+          <w:szCs w:val="28"/>
+          <w:highlight w:val="none"/>
+        </w:rPr>
+      </w:r>
+      <w:r>
+        <w:rPr>
+          <w:b/>
+          <w:bCs/>
+          <w:sz w:val="28"/>
+          <w:szCs w:val="28"/>
+          <w:highlight w:val="none"/>
+        </w:rPr>
+      </w:r>
+      <w:r>
+        <w:rPr>
+          <w:b/>
+          <w:bCs/>
+          <w:sz w:val="28"/>
+          <w:szCs w:val="28"/>
+          <w:highlight w:val="none"/>
+        </w:rPr>
+      </w:r>
+    </w:p>
+    <w:p>
+      <w:pPr>
+        <w:pBdr/>
+        <w:spacing/>
+        <w:ind/>
+        <w:rPr>
+          <w:b/>
+          <w:bCs/>
+          <w:sz w:val="28"/>
+          <w:szCs w:val="28"/>
+          <w:highlight w:val="none"/>
+        </w:rPr>
+      </w:pPr>
+      <w:r>
+        <w:rPr>
+          <w:b/>
+          <w:bCs/>
+          <w:sz w:val="28"/>
+          <w:szCs w:val="28"/>
+          <w:highlight w:val="none"/>
+        </w:rPr>
+      </w:r>
+      <w:r>
+        <w:rPr>
+          <w:b/>
+          <w:bCs/>
+          <w:sz w:val="28"/>
+          <w:szCs w:val="28"/>
+          <w:highlight w:val="none"/>
+        </w:rPr>
+      </w:r>
+      <w:r>
+        <w:rPr>
+          <w:b/>
+          <w:bCs/>
+          <w:sz w:val="28"/>
+          <w:szCs w:val="28"/>
+          <w:highlight w:val="none"/>
+        </w:rPr>
+      </w:r>
+    </w:p>
+    <w:p>
+      <w:pPr>
+        <w:pBdr/>
+        <w:spacing/>
+        <w:ind/>
+        <w:rPr>
+          <w:b/>
+          <w:bCs/>
+          <w:sz w:val="28"/>
+          <w:szCs w:val="28"/>
+          <w:highlight w:val="none"/>
+        </w:rPr>
+      </w:pPr>
+      <w:r>
+        <w:rPr>
+          <w:b/>
+          <w:bCs/>
+          <w:sz w:val="28"/>
+          <w:szCs w:val="28"/>
+          <w:highlight w:val="none"/>
+        </w:rPr>
+      </w:r>
+      <w:r>
+        <w:rPr>
+          <w:b/>
+          <w:bCs/>
+          <w:sz w:val="28"/>
+          <w:szCs w:val="28"/>
+          <w:highlight w:val="none"/>
+        </w:rPr>
+      </w:r>
+      <w:r>
+        <w:rPr>
+          <w:b/>
+          <w:bCs/>
+          <w:sz w:val="28"/>
+          <w:szCs w:val="28"/>
+          <w:highlight w:val="none"/>
+        </w:rPr>
+      </w:r>
+    </w:p>
+    <w:p>
+      <w:pPr>
+        <w:pBdr/>
+        <w:spacing/>
+        <w:ind/>
+        <w:rPr>
+          <w:b/>
+          <w:bCs/>
+          <w:sz w:val="28"/>
+          <w:szCs w:val="28"/>
+          <w:highlight w:val="none"/>
+        </w:rPr>
+      </w:pPr>
+      <w:r>
+        <w:rPr>
+          <w:b/>
+          <w:bCs/>
+          <w:sz w:val="28"/>
+          <w:szCs w:val="28"/>
           <w:highlight w:val="none"/>
         </w:rPr>
         <w:t xml:space="preserve">Exercise 2</w:t>
       </w:r>
-      <w:r/>
+      <w:r>
+        <w:rPr>
+          <w:b/>
+          <w:bCs/>
+          <w:sz w:val="28"/>
+          <w:szCs w:val="28"/>
+        </w:rPr>
+      </w:r>
     </w:p>
     <w:p>
       <w:pPr>
@@ -2249,13 +2930,3621 @@
         <w:pBdr/>
         <w:spacing/>
         <w:ind/>
+        <w:rPr>
+          <w:highlight w:val="none"/>
+        </w:rPr>
+      </w:pPr>
+      <w:r>
+        <w:rPr>
+          <w:highlight w:val="none"/>
+        </w:rPr>
+        <w:t xml:space="preserve">}</w:t>
+      </w:r>
+      <w:r/>
+      <w:r>
+        <w:rPr>
+          <w:highlight w:val="none"/>
+        </w:rPr>
+      </w:r>
+      <w:r>
+        <w:rPr>
+          <w:highlight w:val="none"/>
+        </w:rPr>
+      </w:r>
+      <w:r/>
+      <w:r/>
+      <w:r/>
+      <w:r/>
+      <w:r>
+        <w:rPr>
+          <w:highlight w:val="none"/>
+        </w:rPr>
+      </w:r>
+    </w:p>
+    <w:p>
+      <w:pPr>
+        <w:pBdr/>
+        <w:spacing/>
+        <w:ind/>
+        <w:rPr>
+          <w:highlight w:val="none"/>
+        </w:rPr>
+      </w:pPr>
+      <w:r>
+        <w:rPr>
+          <w:b/>
+          <w:bCs/>
+          <w:sz w:val="28"/>
+          <w:szCs w:val="28"/>
+          <w:highlight w:val="none"/>
+        </w:rPr>
+        <w:t xml:space="preserve">Output</w:t>
+      </w:r>
+      <w:r>
+        <w:rPr>
+          <w:highlight w:val="none"/>
+        </w:rPr>
+      </w:r>
+      <w:r>
+        <w:rPr>
+          <w:highlight w:val="none"/>
+        </w:rPr>
+      </w:r>
+    </w:p>
+    <w:p>
+      <w:pPr>
+        <w:pBdr/>
+        <w:spacing/>
+        <w:ind/>
+        <w:rPr>
+          <w:highlight w:val="none"/>
+        </w:rPr>
+      </w:pPr>
+      <w:r>
+        <w:rPr>
+          <w:highlight w:val="none"/>
+        </w:rPr>
+      </w:r>
+      <w:r>
+        <w:rPr>
+          <w:highlight w:val="none"/>
+        </w:rPr>
+        <w:t xml:space="preserve">Enter number of students: 2</w:t>
+      </w:r>
+      <w:r/>
+      <w:r/>
+    </w:p>
+    <w:p>
+      <w:pPr>
+        <w:pBdr/>
+        <w:spacing/>
+        <w:ind/>
         <w:rPr/>
       </w:pPr>
       <w:r>
         <w:rPr>
           <w:highlight w:val="none"/>
         </w:rPr>
-        <w:t xml:space="preserve">}</w:t>
+        <w:t xml:space="preserve">Subject ID</w:t>
+      </w:r>
+      <w:r/>
+    </w:p>
+    <w:p>
+      <w:pPr>
+        <w:pBdr/>
+        <w:spacing/>
+        <w:ind/>
+        <w:rPr/>
+      </w:pPr>
+      <w:r>
+        <w:rPr>
+          <w:highlight w:val="none"/>
+        </w:rPr>
+        <w:t xml:space="preserve">1. Mathematics</w:t>
+      </w:r>
+      <w:r/>
+    </w:p>
+    <w:p>
+      <w:pPr>
+        <w:pBdr/>
+        <w:spacing/>
+        <w:ind/>
+        <w:rPr/>
+      </w:pPr>
+      <w:r>
+        <w:rPr>
+          <w:highlight w:val="none"/>
+        </w:rPr>
+        <w:t xml:space="preserve">2. Chemistry</w:t>
+      </w:r>
+      <w:r/>
+    </w:p>
+    <w:p>
+      <w:pPr>
+        <w:pBdr/>
+        <w:spacing/>
+        <w:ind/>
+        <w:rPr>
+          <w:highlight w:val="none"/>
+        </w:rPr>
+      </w:pPr>
+      <w:r>
+        <w:rPr>
+          <w:highlight w:val="none"/>
+        </w:rPr>
+        <w:t xml:space="preserve">3.Physics</w:t>
+      </w:r>
+      <w:r>
+        <w:rPr>
+          <w:highlight w:val="none"/>
+        </w:rPr>
+      </w:r>
+    </w:p>
+    <w:p>
+      <w:pPr>
+        <w:pBdr/>
+        <w:spacing/>
+        <w:ind/>
+        <w:rPr>
+          <w:highlight w:val="none"/>
+        </w:rPr>
+      </w:pPr>
+      <w:r>
+        <w:rPr>
+          <w:highlight w:val="none"/>
+        </w:rPr>
+      </w:r>
+      <w:r>
+        <w:rPr>
+          <w:highlight w:val="none"/>
+        </w:rPr>
+      </w:r>
+      <w:r>
+        <w:rPr>
+          <w:highlight w:val="none"/>
+        </w:rPr>
+      </w:r>
+    </w:p>
+    <w:p>
+      <w:pPr>
+        <w:pBdr/>
+        <w:spacing/>
+        <w:ind/>
+        <w:rPr>
+          <w:highlight w:val="none"/>
+        </w:rPr>
+      </w:pPr>
+      <w:r>
+        <w:rPr>
+          <w:highlight w:val="none"/>
+        </w:rPr>
+      </w:r>
+      <w:r>
+        <w:rPr>
+          <w:highlight w:val="none"/>
+        </w:rPr>
+      </w:r>
+      <w:r>
+        <w:rPr>
+          <w:highlight w:val="none"/>
+        </w:rPr>
+      </w:r>
+    </w:p>
+    <w:p>
+      <w:pPr>
+        <w:pBdr/>
+        <w:spacing/>
+        <w:ind/>
+        <w:rPr/>
+      </w:pPr>
+      <w:r>
+        <w:rPr>
+          <w:highlight w:val="none"/>
+        </w:rPr>
+        <w:t xml:space="preserve">------------------Menu---------------------</w:t>
+      </w:r>
+      <w:r/>
+    </w:p>
+    <w:p>
+      <w:pPr>
+        <w:pBdr/>
+        <w:spacing/>
+        <w:ind/>
+        <w:rPr/>
+      </w:pPr>
+      <w:r>
+        <w:rPr>
+          <w:highlight w:val="none"/>
+        </w:rPr>
+        <w:t xml:space="preserve">1. Add Marks of Student</w:t>
+      </w:r>
+      <w:r/>
+    </w:p>
+    <w:p>
+      <w:pPr>
+        <w:pBdr/>
+        <w:spacing/>
+        <w:ind/>
+        <w:rPr/>
+      </w:pPr>
+      <w:r>
+        <w:rPr>
+          <w:highlight w:val="none"/>
+        </w:rPr>
+        <w:t xml:space="preserve">2. Update Marks of Student</w:t>
+      </w:r>
+      <w:r/>
+    </w:p>
+    <w:p>
+      <w:pPr>
+        <w:pBdr/>
+        <w:spacing/>
+        <w:ind/>
+        <w:rPr/>
+      </w:pPr>
+      <w:r>
+        <w:rPr>
+          <w:highlight w:val="none"/>
+        </w:rPr>
+        <w:t xml:space="preserve">3. Get Average of a Subject</w:t>
+      </w:r>
+      <w:r/>
+    </w:p>
+    <w:p>
+      <w:pPr>
+        <w:pBdr/>
+        <w:spacing/>
+        <w:ind/>
+        <w:rPr/>
+      </w:pPr>
+      <w:r>
+        <w:rPr>
+          <w:highlight w:val="none"/>
+        </w:rPr>
+        <w:t xml:space="preserve">4. Get Average of Student</w:t>
+      </w:r>
+      <w:r/>
+    </w:p>
+    <w:p>
+      <w:pPr>
+        <w:pBdr/>
+        <w:spacing/>
+        <w:ind/>
+        <w:rPr/>
+      </w:pPr>
+      <w:r>
+        <w:rPr>
+          <w:highlight w:val="none"/>
+        </w:rPr>
+        <w:t xml:space="preserve">5. Get total marks of Student</w:t>
+      </w:r>
+      <w:r/>
+    </w:p>
+    <w:p>
+      <w:pPr>
+        <w:pBdr/>
+        <w:spacing/>
+        <w:ind/>
+        <w:rPr/>
+      </w:pPr>
+      <w:r>
+        <w:rPr>
+          <w:highlight w:val="none"/>
+        </w:rPr>
+        <w:t xml:space="preserve">6. Exit</w:t>
+      </w:r>
+      <w:r/>
+    </w:p>
+    <w:p>
+      <w:pPr>
+        <w:pBdr/>
+        <w:spacing/>
+        <w:ind/>
+        <w:rPr/>
+      </w:pPr>
+      <w:r>
+        <w:rPr>
+          <w:highlight w:val="none"/>
+        </w:rPr>
+      </w:r>
+      <w:r/>
+    </w:p>
+    <w:p>
+      <w:pPr>
+        <w:pBdr/>
+        <w:spacing/>
+        <w:ind/>
+        <w:rPr/>
+      </w:pPr>
+      <w:r>
+        <w:rPr>
+          <w:highlight w:val="none"/>
+        </w:rPr>
+        <w:t xml:space="preserve">Enter your choice: 1</w:t>
+      </w:r>
+      <w:r/>
+    </w:p>
+    <w:p>
+      <w:pPr>
+        <w:pBdr/>
+        <w:spacing/>
+        <w:ind/>
+        <w:rPr/>
+      </w:pPr>
+      <w:r>
+        <w:rPr>
+          <w:highlight w:val="none"/>
+        </w:rPr>
+      </w:r>
+      <w:r/>
+    </w:p>
+    <w:p>
+      <w:pPr>
+        <w:pBdr/>
+        <w:spacing/>
+        <w:ind/>
+        <w:rPr/>
+      </w:pPr>
+      <w:r>
+        <w:rPr>
+          <w:highlight w:val="none"/>
+        </w:rPr>
+        <w:t xml:space="preserve">Enter Student ID: 1</w:t>
+      </w:r>
+      <w:r/>
+    </w:p>
+    <w:p>
+      <w:pPr>
+        <w:pBdr/>
+        <w:spacing/>
+        <w:ind/>
+        <w:rPr/>
+      </w:pPr>
+      <w:r>
+        <w:rPr>
+          <w:highlight w:val="none"/>
+        </w:rPr>
+      </w:r>
+      <w:r/>
+    </w:p>
+    <w:p>
+      <w:pPr>
+        <w:pBdr/>
+        <w:spacing/>
+        <w:ind/>
+        <w:rPr/>
+      </w:pPr>
+      <w:r>
+        <w:rPr>
+          <w:highlight w:val="none"/>
+        </w:rPr>
+        <w:t xml:space="preserve">Enter Marks for Mathematics: 56</w:t>
+      </w:r>
+      <w:r/>
+    </w:p>
+    <w:p>
+      <w:pPr>
+        <w:pBdr/>
+        <w:spacing/>
+        <w:ind/>
+        <w:rPr/>
+      </w:pPr>
+      <w:r>
+        <w:rPr>
+          <w:highlight w:val="none"/>
+        </w:rPr>
+      </w:r>
+      <w:r/>
+    </w:p>
+    <w:p>
+      <w:pPr>
+        <w:pBdr/>
+        <w:spacing/>
+        <w:ind/>
+        <w:rPr/>
+      </w:pPr>
+      <w:r>
+        <w:rPr>
+          <w:highlight w:val="none"/>
+        </w:rPr>
+        <w:t xml:space="preserve">Enter Marks for Chemistry: 76</w:t>
+      </w:r>
+      <w:r/>
+    </w:p>
+    <w:p>
+      <w:pPr>
+        <w:pBdr/>
+        <w:spacing/>
+        <w:ind/>
+        <w:rPr/>
+      </w:pPr>
+      <w:r>
+        <w:rPr>
+          <w:highlight w:val="none"/>
+        </w:rPr>
+      </w:r>
+      <w:r/>
+    </w:p>
+    <w:p>
+      <w:pPr>
+        <w:pBdr/>
+        <w:spacing/>
+        <w:ind/>
+        <w:rPr/>
+      </w:pPr>
+      <w:r>
+        <w:rPr>
+          <w:highlight w:val="none"/>
+        </w:rPr>
+        <w:t xml:space="preserve">Enter Marks for Physics: 65</w:t>
+      </w:r>
+      <w:r/>
+    </w:p>
+    <w:p>
+      <w:pPr>
+        <w:pBdr/>
+        <w:spacing/>
+        <w:ind/>
+        <w:rPr/>
+      </w:pPr>
+      <w:r>
+        <w:rPr>
+          <w:highlight w:val="none"/>
+        </w:rPr>
+        <w:t xml:space="preserve">Subject ID</w:t>
+      </w:r>
+      <w:r/>
+    </w:p>
+    <w:p>
+      <w:pPr>
+        <w:pBdr/>
+        <w:spacing/>
+        <w:ind/>
+        <w:rPr/>
+      </w:pPr>
+      <w:r>
+        <w:rPr>
+          <w:highlight w:val="none"/>
+        </w:rPr>
+        <w:t xml:space="preserve">1. Mathematics</w:t>
+      </w:r>
+      <w:r/>
+    </w:p>
+    <w:p>
+      <w:pPr>
+        <w:pBdr/>
+        <w:spacing/>
+        <w:ind/>
+        <w:rPr/>
+      </w:pPr>
+      <w:r>
+        <w:rPr>
+          <w:highlight w:val="none"/>
+        </w:rPr>
+        <w:t xml:space="preserve">2. Chemistry</w:t>
+      </w:r>
+      <w:r/>
+    </w:p>
+    <w:p>
+      <w:pPr>
+        <w:pBdr/>
+        <w:spacing/>
+        <w:ind/>
+        <w:rPr/>
+      </w:pPr>
+      <w:r>
+        <w:rPr>
+          <w:highlight w:val="none"/>
+        </w:rPr>
+        <w:t xml:space="preserve">3.Physics</w:t>
+      </w:r>
+      <w:r/>
+    </w:p>
+    <w:p>
+      <w:pPr>
+        <w:pBdr/>
+        <w:spacing/>
+        <w:ind/>
+        <w:rPr/>
+      </w:pPr>
+      <w:r>
+        <w:rPr>
+          <w:highlight w:val="none"/>
+        </w:rPr>
+      </w:r>
+      <w:r/>
+    </w:p>
+    <w:p>
+      <w:pPr>
+        <w:pBdr/>
+        <w:spacing/>
+        <w:ind/>
+        <w:rPr/>
+      </w:pPr>
+      <w:r>
+        <w:rPr>
+          <w:highlight w:val="none"/>
+        </w:rPr>
+        <w:t xml:space="preserve">------------------Menu---------------------</w:t>
+      </w:r>
+      <w:r/>
+    </w:p>
+    <w:p>
+      <w:pPr>
+        <w:pBdr/>
+        <w:spacing/>
+        <w:ind/>
+        <w:rPr/>
+      </w:pPr>
+      <w:r>
+        <w:rPr>
+          <w:highlight w:val="none"/>
+        </w:rPr>
+        <w:t xml:space="preserve">1. Add Marks of Student</w:t>
+      </w:r>
+      <w:r/>
+    </w:p>
+    <w:p>
+      <w:pPr>
+        <w:pBdr/>
+        <w:spacing/>
+        <w:ind/>
+        <w:rPr/>
+      </w:pPr>
+      <w:r>
+        <w:rPr>
+          <w:highlight w:val="none"/>
+        </w:rPr>
+        <w:t xml:space="preserve">2. Update Marks of Student</w:t>
+      </w:r>
+      <w:r/>
+    </w:p>
+    <w:p>
+      <w:pPr>
+        <w:pBdr/>
+        <w:spacing/>
+        <w:ind/>
+        <w:rPr/>
+      </w:pPr>
+      <w:r>
+        <w:rPr>
+          <w:highlight w:val="none"/>
+        </w:rPr>
+        <w:t xml:space="preserve">3. Get Average of a Subject</w:t>
+      </w:r>
+      <w:r/>
+    </w:p>
+    <w:p>
+      <w:pPr>
+        <w:pBdr/>
+        <w:spacing/>
+        <w:ind/>
+        <w:rPr/>
+      </w:pPr>
+      <w:r>
+        <w:rPr>
+          <w:highlight w:val="none"/>
+        </w:rPr>
+        <w:t xml:space="preserve">4. Get Average of Student</w:t>
+      </w:r>
+      <w:r/>
+    </w:p>
+    <w:p>
+      <w:pPr>
+        <w:pBdr/>
+        <w:spacing/>
+        <w:ind/>
+        <w:rPr/>
+      </w:pPr>
+      <w:r>
+        <w:rPr>
+          <w:highlight w:val="none"/>
+        </w:rPr>
+        <w:t xml:space="preserve">5. Get total marks of Student</w:t>
+      </w:r>
+      <w:r/>
+    </w:p>
+    <w:p>
+      <w:pPr>
+        <w:pBdr/>
+        <w:spacing/>
+        <w:ind/>
+        <w:rPr/>
+      </w:pPr>
+      <w:r>
+        <w:rPr>
+          <w:highlight w:val="none"/>
+        </w:rPr>
+        <w:t xml:space="preserve">6. Exit</w:t>
+      </w:r>
+      <w:r/>
+    </w:p>
+    <w:p>
+      <w:pPr>
+        <w:pBdr/>
+        <w:spacing/>
+        <w:ind/>
+        <w:rPr/>
+      </w:pPr>
+      <w:r>
+        <w:rPr>
+          <w:highlight w:val="none"/>
+        </w:rPr>
+      </w:r>
+      <w:r/>
+    </w:p>
+    <w:p>
+      <w:pPr>
+        <w:pBdr/>
+        <w:spacing/>
+        <w:ind/>
+        <w:rPr/>
+      </w:pPr>
+      <w:r>
+        <w:rPr>
+          <w:highlight w:val="none"/>
+        </w:rPr>
+        <w:t xml:space="preserve">Enter your choice: 2</w:t>
+      </w:r>
+      <w:r/>
+    </w:p>
+    <w:p>
+      <w:pPr>
+        <w:pBdr/>
+        <w:spacing/>
+        <w:ind/>
+        <w:rPr/>
+      </w:pPr>
+      <w:r>
+        <w:rPr>
+          <w:highlight w:val="none"/>
+        </w:rPr>
+      </w:r>
+      <w:r/>
+    </w:p>
+    <w:p>
+      <w:pPr>
+        <w:pBdr/>
+        <w:spacing/>
+        <w:ind/>
+        <w:rPr/>
+      </w:pPr>
+      <w:r>
+        <w:rPr>
+          <w:highlight w:val="none"/>
+        </w:rPr>
+        <w:t xml:space="preserve">Enter Student ID: 1</w:t>
+      </w:r>
+      <w:r/>
+    </w:p>
+    <w:p>
+      <w:pPr>
+        <w:pBdr/>
+        <w:spacing/>
+        <w:ind/>
+        <w:rPr/>
+      </w:pPr>
+      <w:r>
+        <w:rPr>
+          <w:highlight w:val="none"/>
+        </w:rPr>
+      </w:r>
+      <w:r/>
+    </w:p>
+    <w:p>
+      <w:pPr>
+        <w:pBdr/>
+        <w:spacing/>
+        <w:ind/>
+        <w:rPr/>
+      </w:pPr>
+      <w:r>
+        <w:rPr>
+          <w:highlight w:val="none"/>
+        </w:rPr>
+        <w:t xml:space="preserve">Enter Subject ID: 2</w:t>
+      </w:r>
+      <w:r/>
+    </w:p>
+    <w:p>
+      <w:pPr>
+        <w:pBdr/>
+        <w:spacing/>
+        <w:ind/>
+        <w:rPr/>
+      </w:pPr>
+      <w:r>
+        <w:rPr>
+          <w:highlight w:val="none"/>
+        </w:rPr>
+      </w:r>
+      <w:r/>
+    </w:p>
+    <w:p>
+      <w:pPr>
+        <w:pBdr/>
+        <w:spacing/>
+        <w:ind/>
+        <w:rPr/>
+      </w:pPr>
+      <w:r>
+        <w:rPr>
+          <w:highlight w:val="none"/>
+        </w:rPr>
+        <w:t xml:space="preserve">Enter New Marks: 70</w:t>
+      </w:r>
+      <w:r/>
+    </w:p>
+    <w:p>
+      <w:pPr>
+        <w:pBdr/>
+        <w:spacing/>
+        <w:ind/>
+        <w:rPr/>
+      </w:pPr>
+      <w:r>
+        <w:rPr>
+          <w:highlight w:val="none"/>
+        </w:rPr>
+        <w:t xml:space="preserve">Subject ID</w:t>
+      </w:r>
+      <w:r/>
+    </w:p>
+    <w:p>
+      <w:pPr>
+        <w:pBdr/>
+        <w:spacing/>
+        <w:ind/>
+        <w:rPr/>
+      </w:pPr>
+      <w:r>
+        <w:rPr>
+          <w:highlight w:val="none"/>
+        </w:rPr>
+        <w:t xml:space="preserve">1. Mathematics</w:t>
+      </w:r>
+      <w:r/>
+    </w:p>
+    <w:p>
+      <w:pPr>
+        <w:pBdr/>
+        <w:spacing/>
+        <w:ind/>
+        <w:rPr/>
+      </w:pPr>
+      <w:r>
+        <w:rPr>
+          <w:highlight w:val="none"/>
+        </w:rPr>
+        <w:t xml:space="preserve">2. Chemistry</w:t>
+      </w:r>
+      <w:r/>
+    </w:p>
+    <w:p>
+      <w:pPr>
+        <w:pBdr/>
+        <w:spacing/>
+        <w:ind/>
+        <w:rPr/>
+      </w:pPr>
+      <w:r>
+        <w:rPr>
+          <w:highlight w:val="none"/>
+        </w:rPr>
+        <w:t xml:space="preserve">3.Physics</w:t>
+      </w:r>
+      <w:r/>
+    </w:p>
+    <w:p>
+      <w:pPr>
+        <w:pBdr/>
+        <w:spacing/>
+        <w:ind/>
+        <w:rPr/>
+      </w:pPr>
+      <w:r>
+        <w:rPr>
+          <w:highlight w:val="none"/>
+        </w:rPr>
+      </w:r>
+      <w:r/>
+    </w:p>
+    <w:p>
+      <w:pPr>
+        <w:pBdr/>
+        <w:spacing/>
+        <w:ind/>
+        <w:rPr/>
+      </w:pPr>
+      <w:r>
+        <w:rPr>
+          <w:highlight w:val="none"/>
+        </w:rPr>
+        <w:t xml:space="preserve">------------------Menu---------------------</w:t>
+      </w:r>
+      <w:r/>
+    </w:p>
+    <w:p>
+      <w:pPr>
+        <w:pBdr/>
+        <w:spacing/>
+        <w:ind/>
+        <w:rPr/>
+      </w:pPr>
+      <w:r>
+        <w:rPr>
+          <w:highlight w:val="none"/>
+        </w:rPr>
+        <w:t xml:space="preserve">1. Add Marks of Student</w:t>
+      </w:r>
+      <w:r/>
+    </w:p>
+    <w:p>
+      <w:pPr>
+        <w:pBdr/>
+        <w:spacing/>
+        <w:ind/>
+        <w:rPr/>
+      </w:pPr>
+      <w:r>
+        <w:rPr>
+          <w:highlight w:val="none"/>
+        </w:rPr>
+        <w:t xml:space="preserve">2. Update Marks of Student</w:t>
+      </w:r>
+      <w:r/>
+    </w:p>
+    <w:p>
+      <w:pPr>
+        <w:pBdr/>
+        <w:spacing/>
+        <w:ind/>
+        <w:rPr/>
+      </w:pPr>
+      <w:r>
+        <w:rPr>
+          <w:highlight w:val="none"/>
+        </w:rPr>
+        <w:t xml:space="preserve">3. Get Average of a Subject</w:t>
+      </w:r>
+      <w:r/>
+    </w:p>
+    <w:p>
+      <w:pPr>
+        <w:pBdr/>
+        <w:spacing/>
+        <w:ind/>
+        <w:rPr/>
+      </w:pPr>
+      <w:r>
+        <w:rPr>
+          <w:highlight w:val="none"/>
+        </w:rPr>
+        <w:t xml:space="preserve">4. Get Average of Student</w:t>
+      </w:r>
+      <w:r/>
+    </w:p>
+    <w:p>
+      <w:pPr>
+        <w:pBdr/>
+        <w:spacing/>
+        <w:ind/>
+        <w:rPr/>
+      </w:pPr>
+      <w:r>
+        <w:rPr>
+          <w:highlight w:val="none"/>
+        </w:rPr>
+        <w:t xml:space="preserve">5. Get total marks of Student</w:t>
+      </w:r>
+      <w:r/>
+    </w:p>
+    <w:p>
+      <w:pPr>
+        <w:pBdr/>
+        <w:spacing/>
+        <w:ind/>
+        <w:rPr/>
+      </w:pPr>
+      <w:r>
+        <w:rPr>
+          <w:highlight w:val="none"/>
+        </w:rPr>
+        <w:t xml:space="preserve">6. Exit</w:t>
+      </w:r>
+      <w:r/>
+    </w:p>
+    <w:p>
+      <w:pPr>
+        <w:pBdr/>
+        <w:spacing/>
+        <w:ind/>
+        <w:rPr/>
+      </w:pPr>
+      <w:r>
+        <w:rPr>
+          <w:highlight w:val="none"/>
+        </w:rPr>
+      </w:r>
+      <w:r/>
+    </w:p>
+    <w:p>
+      <w:pPr>
+        <w:pBdr/>
+        <w:spacing/>
+        <w:ind/>
+        <w:rPr/>
+      </w:pPr>
+      <w:r>
+        <w:rPr>
+          <w:highlight w:val="none"/>
+        </w:rPr>
+        <w:t xml:space="preserve">Enter your choice: 5</w:t>
+      </w:r>
+      <w:r/>
+    </w:p>
+    <w:p>
+      <w:pPr>
+        <w:pBdr/>
+        <w:spacing/>
+        <w:ind/>
+        <w:rPr/>
+      </w:pPr>
+      <w:r>
+        <w:rPr>
+          <w:highlight w:val="none"/>
+        </w:rPr>
+      </w:r>
+      <w:r/>
+    </w:p>
+    <w:p>
+      <w:pPr>
+        <w:pBdr/>
+        <w:spacing/>
+        <w:ind/>
+        <w:rPr/>
+      </w:pPr>
+      <w:r>
+        <w:rPr>
+          <w:highlight w:val="none"/>
+        </w:rPr>
+        <w:t xml:space="preserve">Enter the Student's ID, you want to find the average of: 1</w:t>
+      </w:r>
+      <w:r/>
+    </w:p>
+    <w:p>
+      <w:pPr>
+        <w:pBdr/>
+        <w:spacing/>
+        <w:ind/>
+        <w:rPr/>
+      </w:pPr>
+      <w:r>
+        <w:rPr>
+          <w:highlight w:val="none"/>
+        </w:rPr>
+      </w:r>
+      <w:r/>
+    </w:p>
+    <w:p>
+      <w:pPr>
+        <w:pBdr/>
+        <w:spacing/>
+        <w:ind/>
+        <w:rPr/>
+      </w:pPr>
+      <w:r>
+        <w:rPr>
+          <w:highlight w:val="none"/>
+        </w:rPr>
+        <w:t xml:space="preserve">Total Marks of Student 1 is 191</w:t>
+      </w:r>
+      <w:r/>
+    </w:p>
+    <w:p>
+      <w:pPr>
+        <w:pBdr/>
+        <w:spacing/>
+        <w:ind/>
+        <w:rPr/>
+      </w:pPr>
+      <w:r>
+        <w:rPr>
+          <w:highlight w:val="none"/>
+        </w:rPr>
+        <w:t xml:space="preserve">Subject ID</w:t>
+      </w:r>
+      <w:r/>
+    </w:p>
+    <w:p>
+      <w:pPr>
+        <w:pBdr/>
+        <w:spacing/>
+        <w:ind/>
+        <w:rPr/>
+      </w:pPr>
+      <w:r>
+        <w:rPr>
+          <w:highlight w:val="none"/>
+        </w:rPr>
+        <w:t xml:space="preserve">1. Mathematics</w:t>
+      </w:r>
+      <w:r/>
+    </w:p>
+    <w:p>
+      <w:pPr>
+        <w:pBdr/>
+        <w:spacing/>
+        <w:ind/>
+        <w:rPr/>
+      </w:pPr>
+      <w:r>
+        <w:rPr>
+          <w:highlight w:val="none"/>
+        </w:rPr>
+        <w:t xml:space="preserve">2. Chemistry</w:t>
+      </w:r>
+      <w:r/>
+    </w:p>
+    <w:p>
+      <w:pPr>
+        <w:pBdr/>
+        <w:spacing/>
+        <w:ind/>
+        <w:rPr/>
+      </w:pPr>
+      <w:r>
+        <w:rPr>
+          <w:highlight w:val="none"/>
+        </w:rPr>
+        <w:t xml:space="preserve">3.Physics</w:t>
+      </w:r>
+      <w:r/>
+    </w:p>
+    <w:p>
+      <w:pPr>
+        <w:pBdr/>
+        <w:spacing/>
+        <w:ind/>
+        <w:rPr/>
+      </w:pPr>
+      <w:r>
+        <w:rPr>
+          <w:highlight w:val="none"/>
+        </w:rPr>
+      </w:r>
+      <w:r/>
+    </w:p>
+    <w:p>
+      <w:pPr>
+        <w:pBdr/>
+        <w:spacing/>
+        <w:ind/>
+        <w:rPr/>
+      </w:pPr>
+      <w:r>
+        <w:rPr>
+          <w:highlight w:val="none"/>
+        </w:rPr>
+        <w:t xml:space="preserve">------------------Menu---------------------</w:t>
+      </w:r>
+      <w:r/>
+    </w:p>
+    <w:p>
+      <w:pPr>
+        <w:pBdr/>
+        <w:spacing/>
+        <w:ind/>
+        <w:rPr/>
+      </w:pPr>
+      <w:r>
+        <w:rPr>
+          <w:highlight w:val="none"/>
+        </w:rPr>
+        <w:t xml:space="preserve">1. Add Marks of Student</w:t>
+      </w:r>
+      <w:r/>
+    </w:p>
+    <w:p>
+      <w:pPr>
+        <w:pBdr/>
+        <w:spacing/>
+        <w:ind/>
+        <w:rPr/>
+      </w:pPr>
+      <w:r>
+        <w:rPr>
+          <w:highlight w:val="none"/>
+        </w:rPr>
+        <w:t xml:space="preserve">2. Update Marks of Student</w:t>
+      </w:r>
+      <w:r/>
+    </w:p>
+    <w:p>
+      <w:pPr>
+        <w:pBdr/>
+        <w:spacing/>
+        <w:ind/>
+        <w:rPr/>
+      </w:pPr>
+      <w:r>
+        <w:rPr>
+          <w:highlight w:val="none"/>
+        </w:rPr>
+        <w:t xml:space="preserve">3. Get Average of a Subject</w:t>
+      </w:r>
+      <w:r/>
+    </w:p>
+    <w:p>
+      <w:pPr>
+        <w:pBdr/>
+        <w:spacing/>
+        <w:ind/>
+        <w:rPr/>
+      </w:pPr>
+      <w:r>
+        <w:rPr>
+          <w:highlight w:val="none"/>
+        </w:rPr>
+        <w:t xml:space="preserve">4. Get Average of Student</w:t>
+      </w:r>
+      <w:r/>
+    </w:p>
+    <w:p>
+      <w:pPr>
+        <w:pBdr/>
+        <w:spacing/>
+        <w:ind/>
+        <w:rPr/>
+      </w:pPr>
+      <w:r>
+        <w:rPr>
+          <w:highlight w:val="none"/>
+        </w:rPr>
+        <w:t xml:space="preserve">5. Get total marks of Student</w:t>
+      </w:r>
+      <w:r/>
+    </w:p>
+    <w:p>
+      <w:pPr>
+        <w:pBdr/>
+        <w:spacing/>
+        <w:ind/>
+        <w:rPr/>
+      </w:pPr>
+      <w:r>
+        <w:rPr>
+          <w:highlight w:val="none"/>
+        </w:rPr>
+        <w:t xml:space="preserve">6. Exit</w:t>
+      </w:r>
+      <w:r/>
+    </w:p>
+    <w:p>
+      <w:pPr>
+        <w:pBdr/>
+        <w:spacing/>
+        <w:ind/>
+        <w:rPr/>
+      </w:pPr>
+      <w:r>
+        <w:rPr>
+          <w:highlight w:val="none"/>
+        </w:rPr>
+      </w:r>
+      <w:r/>
+    </w:p>
+    <w:p>
+      <w:pPr>
+        <w:pBdr/>
+        <w:spacing/>
+        <w:ind/>
+        <w:rPr/>
+      </w:pPr>
+      <w:r>
+        <w:rPr>
+          <w:highlight w:val="none"/>
+        </w:rPr>
+        <w:t xml:space="preserve">Enter your choice: 1</w:t>
+      </w:r>
+      <w:r/>
+    </w:p>
+    <w:p>
+      <w:pPr>
+        <w:pBdr/>
+        <w:spacing/>
+        <w:ind/>
+        <w:rPr/>
+      </w:pPr>
+      <w:r>
+        <w:rPr>
+          <w:highlight w:val="none"/>
+        </w:rPr>
+      </w:r>
+      <w:r/>
+    </w:p>
+    <w:p>
+      <w:pPr>
+        <w:pBdr/>
+        <w:spacing/>
+        <w:ind/>
+        <w:rPr/>
+      </w:pPr>
+      <w:r>
+        <w:rPr>
+          <w:highlight w:val="none"/>
+        </w:rPr>
+        <w:t xml:space="preserve">Enter Student ID: 2</w:t>
+      </w:r>
+      <w:r/>
+    </w:p>
+    <w:p>
+      <w:pPr>
+        <w:pBdr/>
+        <w:spacing/>
+        <w:ind/>
+        <w:rPr/>
+      </w:pPr>
+      <w:r>
+        <w:rPr>
+          <w:highlight w:val="none"/>
+        </w:rPr>
+      </w:r>
+      <w:r/>
+    </w:p>
+    <w:p>
+      <w:pPr>
+        <w:pBdr/>
+        <w:spacing/>
+        <w:ind/>
+        <w:rPr/>
+      </w:pPr>
+      <w:r>
+        <w:rPr>
+          <w:highlight w:val="none"/>
+        </w:rPr>
+        <w:t xml:space="preserve">Enter Marks for Mathematics: 90</w:t>
+      </w:r>
+      <w:r/>
+    </w:p>
+    <w:p>
+      <w:pPr>
+        <w:pBdr/>
+        <w:spacing/>
+        <w:ind/>
+        <w:rPr/>
+      </w:pPr>
+      <w:r>
+        <w:rPr>
+          <w:highlight w:val="none"/>
+        </w:rPr>
+      </w:r>
+      <w:r/>
+    </w:p>
+    <w:p>
+      <w:pPr>
+        <w:pBdr/>
+        <w:spacing/>
+        <w:ind/>
+        <w:rPr/>
+      </w:pPr>
+      <w:r>
+        <w:rPr>
+          <w:highlight w:val="none"/>
+        </w:rPr>
+        <w:t xml:space="preserve">Enter Marks for Chemistry: 89</w:t>
+      </w:r>
+      <w:r/>
+    </w:p>
+    <w:p>
+      <w:pPr>
+        <w:pBdr/>
+        <w:spacing/>
+        <w:ind/>
+        <w:rPr/>
+      </w:pPr>
+      <w:r>
+        <w:rPr>
+          <w:highlight w:val="none"/>
+        </w:rPr>
+      </w:r>
+      <w:r/>
+    </w:p>
+    <w:p>
+      <w:pPr>
+        <w:pBdr/>
+        <w:spacing/>
+        <w:ind/>
+        <w:rPr/>
+      </w:pPr>
+      <w:r>
+        <w:rPr>
+          <w:highlight w:val="none"/>
+        </w:rPr>
+        <w:t xml:space="preserve">Enter Marks for Physics: 88</w:t>
+      </w:r>
+      <w:r/>
+    </w:p>
+    <w:p>
+      <w:pPr>
+        <w:pBdr/>
+        <w:spacing/>
+        <w:ind/>
+        <w:rPr/>
+      </w:pPr>
+      <w:r>
+        <w:rPr>
+          <w:highlight w:val="none"/>
+        </w:rPr>
+        <w:t xml:space="preserve">Subject ID</w:t>
+      </w:r>
+      <w:r/>
+    </w:p>
+    <w:p>
+      <w:pPr>
+        <w:pBdr/>
+        <w:spacing/>
+        <w:ind/>
+        <w:rPr/>
+      </w:pPr>
+      <w:r>
+        <w:rPr>
+          <w:highlight w:val="none"/>
+        </w:rPr>
+        <w:t xml:space="preserve">1. Mathematics</w:t>
+      </w:r>
+      <w:r/>
+    </w:p>
+    <w:p>
+      <w:pPr>
+        <w:pBdr/>
+        <w:spacing/>
+        <w:ind/>
+        <w:rPr/>
+      </w:pPr>
+      <w:r>
+        <w:rPr>
+          <w:highlight w:val="none"/>
+        </w:rPr>
+        <w:t xml:space="preserve">2. Chemistry</w:t>
+      </w:r>
+      <w:r/>
+    </w:p>
+    <w:p>
+      <w:pPr>
+        <w:pBdr/>
+        <w:spacing/>
+        <w:ind/>
+        <w:rPr/>
+      </w:pPr>
+      <w:r>
+        <w:rPr>
+          <w:highlight w:val="none"/>
+        </w:rPr>
+        <w:t xml:space="preserve">3.Physics</w:t>
+      </w:r>
+      <w:r/>
+    </w:p>
+    <w:p>
+      <w:pPr>
+        <w:pBdr/>
+        <w:spacing/>
+        <w:ind/>
+        <w:rPr/>
+      </w:pPr>
+      <w:r>
+        <w:rPr>
+          <w:highlight w:val="none"/>
+        </w:rPr>
+      </w:r>
+      <w:r/>
+    </w:p>
+    <w:p>
+      <w:pPr>
+        <w:pBdr/>
+        <w:spacing/>
+        <w:ind/>
+        <w:rPr/>
+      </w:pPr>
+      <w:r>
+        <w:rPr>
+          <w:highlight w:val="none"/>
+        </w:rPr>
+        <w:t xml:space="preserve">------------------Menu---------------------</w:t>
+      </w:r>
+      <w:r/>
+    </w:p>
+    <w:p>
+      <w:pPr>
+        <w:pBdr/>
+        <w:spacing/>
+        <w:ind/>
+        <w:rPr/>
+      </w:pPr>
+      <w:r>
+        <w:rPr>
+          <w:highlight w:val="none"/>
+        </w:rPr>
+        <w:t xml:space="preserve">1. Add Marks of Student</w:t>
+      </w:r>
+      <w:r/>
+    </w:p>
+    <w:p>
+      <w:pPr>
+        <w:pBdr/>
+        <w:spacing/>
+        <w:ind/>
+        <w:rPr/>
+      </w:pPr>
+      <w:r>
+        <w:rPr>
+          <w:highlight w:val="none"/>
+        </w:rPr>
+        <w:t xml:space="preserve">2. Update Marks of Student</w:t>
+      </w:r>
+      <w:r/>
+    </w:p>
+    <w:p>
+      <w:pPr>
+        <w:pBdr/>
+        <w:spacing/>
+        <w:ind/>
+        <w:rPr/>
+      </w:pPr>
+      <w:r>
+        <w:rPr>
+          <w:highlight w:val="none"/>
+        </w:rPr>
+        <w:t xml:space="preserve">3. Get Average of a Subject</w:t>
+      </w:r>
+      <w:r/>
+    </w:p>
+    <w:p>
+      <w:pPr>
+        <w:pBdr/>
+        <w:spacing/>
+        <w:ind/>
+        <w:rPr/>
+      </w:pPr>
+      <w:r>
+        <w:rPr>
+          <w:highlight w:val="none"/>
+        </w:rPr>
+        <w:t xml:space="preserve">4. Get Average of Student</w:t>
+      </w:r>
+      <w:r/>
+    </w:p>
+    <w:p>
+      <w:pPr>
+        <w:pBdr/>
+        <w:spacing/>
+        <w:ind/>
+        <w:rPr/>
+      </w:pPr>
+      <w:r>
+        <w:rPr>
+          <w:highlight w:val="none"/>
+        </w:rPr>
+        <w:t xml:space="preserve">5. Get total marks of Student</w:t>
+      </w:r>
+      <w:r/>
+    </w:p>
+    <w:p>
+      <w:pPr>
+        <w:pBdr/>
+        <w:spacing/>
+        <w:ind/>
+        <w:rPr/>
+      </w:pPr>
+      <w:r>
+        <w:rPr>
+          <w:highlight w:val="none"/>
+        </w:rPr>
+        <w:t xml:space="preserve">6. Exit</w:t>
+      </w:r>
+      <w:r/>
+    </w:p>
+    <w:p>
+      <w:pPr>
+        <w:pBdr/>
+        <w:spacing/>
+        <w:ind/>
+        <w:rPr/>
+      </w:pPr>
+      <w:r>
+        <w:rPr>
+          <w:highlight w:val="none"/>
+        </w:rPr>
+      </w:r>
+      <w:r/>
+    </w:p>
+    <w:p>
+      <w:pPr>
+        <w:pBdr/>
+        <w:spacing/>
+        <w:ind/>
+        <w:rPr/>
+      </w:pPr>
+      <w:r>
+        <w:rPr>
+          <w:highlight w:val="none"/>
+        </w:rPr>
+        <w:t xml:space="preserve">Enter your choice: 4</w:t>
+      </w:r>
+      <w:r/>
+    </w:p>
+    <w:p>
+      <w:pPr>
+        <w:pBdr/>
+        <w:spacing/>
+        <w:ind/>
+        <w:rPr/>
+      </w:pPr>
+      <w:r>
+        <w:rPr>
+          <w:highlight w:val="none"/>
+        </w:rPr>
+      </w:r>
+      <w:r/>
+    </w:p>
+    <w:p>
+      <w:pPr>
+        <w:pBdr/>
+        <w:spacing/>
+        <w:ind/>
+        <w:rPr/>
+      </w:pPr>
+      <w:r>
+        <w:rPr>
+          <w:highlight w:val="none"/>
+        </w:rPr>
+        <w:t xml:space="preserve">Enter the Student's ID, you want to find the average of: 2</w:t>
+      </w:r>
+      <w:r/>
+    </w:p>
+    <w:p>
+      <w:pPr>
+        <w:pBdr/>
+        <w:spacing/>
+        <w:ind/>
+        <w:rPr/>
+      </w:pPr>
+      <w:r>
+        <w:rPr>
+          <w:highlight w:val="none"/>
+        </w:rPr>
+      </w:r>
+      <w:r/>
+    </w:p>
+    <w:p>
+      <w:pPr>
+        <w:pBdr/>
+        <w:spacing/>
+        <w:ind/>
+        <w:rPr/>
+      </w:pPr>
+      <w:r>
+        <w:rPr>
+          <w:highlight w:val="none"/>
+        </w:rPr>
+        <w:t xml:space="preserve">Average of student 2 is 89.00</w:t>
+      </w:r>
+      <w:r/>
+    </w:p>
+    <w:p>
+      <w:pPr>
+        <w:pBdr/>
+        <w:spacing/>
+        <w:ind/>
+        <w:rPr/>
+      </w:pPr>
+      <w:r>
+        <w:rPr>
+          <w:highlight w:val="none"/>
+        </w:rPr>
+        <w:t xml:space="preserve">Subject ID</w:t>
+      </w:r>
+      <w:r/>
+    </w:p>
+    <w:p>
+      <w:pPr>
+        <w:pBdr/>
+        <w:spacing/>
+        <w:ind/>
+        <w:rPr/>
+      </w:pPr>
+      <w:r>
+        <w:rPr>
+          <w:highlight w:val="none"/>
+        </w:rPr>
+        <w:t xml:space="preserve">1. Mathematics</w:t>
+      </w:r>
+      <w:r/>
+    </w:p>
+    <w:p>
+      <w:pPr>
+        <w:pBdr/>
+        <w:spacing/>
+        <w:ind/>
+        <w:rPr/>
+      </w:pPr>
+      <w:r>
+        <w:rPr>
+          <w:highlight w:val="none"/>
+        </w:rPr>
+        <w:t xml:space="preserve">2. Chemistry</w:t>
+      </w:r>
+      <w:r/>
+    </w:p>
+    <w:p>
+      <w:pPr>
+        <w:pBdr/>
+        <w:spacing/>
+        <w:ind/>
+        <w:rPr/>
+      </w:pPr>
+      <w:r>
+        <w:rPr>
+          <w:highlight w:val="none"/>
+        </w:rPr>
+        <w:t xml:space="preserve">3.Physics</w:t>
+      </w:r>
+      <w:r/>
+    </w:p>
+    <w:p>
+      <w:pPr>
+        <w:pBdr/>
+        <w:spacing/>
+        <w:ind/>
+        <w:rPr/>
+      </w:pPr>
+      <w:r>
+        <w:rPr>
+          <w:highlight w:val="none"/>
+        </w:rPr>
+      </w:r>
+      <w:r/>
+    </w:p>
+    <w:p>
+      <w:pPr>
+        <w:pBdr/>
+        <w:spacing/>
+        <w:ind/>
+        <w:rPr/>
+      </w:pPr>
+      <w:r>
+        <w:rPr>
+          <w:highlight w:val="none"/>
+        </w:rPr>
+        <w:t xml:space="preserve">------------------Menu---------------------</w:t>
+      </w:r>
+      <w:r/>
+    </w:p>
+    <w:p>
+      <w:pPr>
+        <w:pBdr/>
+        <w:spacing/>
+        <w:ind/>
+        <w:rPr/>
+      </w:pPr>
+      <w:r>
+        <w:rPr>
+          <w:highlight w:val="none"/>
+        </w:rPr>
+        <w:t xml:space="preserve">1. Add Marks of Student</w:t>
+      </w:r>
+      <w:r/>
+    </w:p>
+    <w:p>
+      <w:pPr>
+        <w:pBdr/>
+        <w:spacing/>
+        <w:ind/>
+        <w:rPr/>
+      </w:pPr>
+      <w:r>
+        <w:rPr>
+          <w:highlight w:val="none"/>
+        </w:rPr>
+        <w:t xml:space="preserve">2. Update Marks of Student</w:t>
+      </w:r>
+      <w:r/>
+    </w:p>
+    <w:p>
+      <w:pPr>
+        <w:pBdr/>
+        <w:spacing/>
+        <w:ind/>
+        <w:rPr/>
+      </w:pPr>
+      <w:r>
+        <w:rPr>
+          <w:highlight w:val="none"/>
+        </w:rPr>
+        <w:t xml:space="preserve">3. Get Average of a Subject</w:t>
+      </w:r>
+      <w:r/>
+    </w:p>
+    <w:p>
+      <w:pPr>
+        <w:pBdr/>
+        <w:spacing/>
+        <w:ind/>
+        <w:rPr/>
+      </w:pPr>
+      <w:r>
+        <w:rPr>
+          <w:highlight w:val="none"/>
+        </w:rPr>
+        <w:t xml:space="preserve">4. Get Average of Student</w:t>
+      </w:r>
+      <w:r/>
+    </w:p>
+    <w:p>
+      <w:pPr>
+        <w:pBdr/>
+        <w:spacing/>
+        <w:ind/>
+        <w:rPr/>
+      </w:pPr>
+      <w:r>
+        <w:rPr>
+          <w:highlight w:val="none"/>
+        </w:rPr>
+        <w:t xml:space="preserve">5. Get total marks of Student</w:t>
+      </w:r>
+      <w:r/>
+    </w:p>
+    <w:p>
+      <w:pPr>
+        <w:pBdr/>
+        <w:spacing/>
+        <w:ind/>
+        <w:rPr/>
+      </w:pPr>
+      <w:r>
+        <w:rPr>
+          <w:highlight w:val="none"/>
+        </w:rPr>
+        <w:t xml:space="preserve">6. Exit</w:t>
+      </w:r>
+      <w:r/>
+    </w:p>
+    <w:p>
+      <w:pPr>
+        <w:pBdr/>
+        <w:spacing/>
+        <w:ind/>
+        <w:rPr/>
+      </w:pPr>
+      <w:r>
+        <w:rPr>
+          <w:highlight w:val="none"/>
+        </w:rPr>
+      </w:r>
+      <w:r/>
+    </w:p>
+    <w:p>
+      <w:pPr>
+        <w:pBdr/>
+        <w:spacing/>
+        <w:ind/>
+        <w:rPr/>
+      </w:pPr>
+      <w:r>
+        <w:rPr>
+          <w:highlight w:val="none"/>
+        </w:rPr>
+        <w:t xml:space="preserve">Enter your choice: 2</w:t>
+      </w:r>
+      <w:r/>
+    </w:p>
+    <w:p>
+      <w:pPr>
+        <w:pBdr/>
+        <w:spacing/>
+        <w:ind/>
+        <w:rPr/>
+      </w:pPr>
+      <w:r>
+        <w:rPr>
+          <w:highlight w:val="none"/>
+        </w:rPr>
+      </w:r>
+      <w:r/>
+    </w:p>
+    <w:p>
+      <w:pPr>
+        <w:pBdr/>
+        <w:spacing/>
+        <w:ind/>
+        <w:rPr/>
+      </w:pPr>
+      <w:r>
+        <w:rPr>
+          <w:highlight w:val="none"/>
+        </w:rPr>
+        <w:t xml:space="preserve">Enter Student ID: 2</w:t>
+      </w:r>
+      <w:r/>
+    </w:p>
+    <w:p>
+      <w:pPr>
+        <w:pBdr/>
+        <w:spacing/>
+        <w:ind/>
+        <w:rPr/>
+      </w:pPr>
+      <w:r>
+        <w:rPr>
+          <w:highlight w:val="none"/>
+        </w:rPr>
+      </w:r>
+      <w:r/>
+    </w:p>
+    <w:p>
+      <w:pPr>
+        <w:pBdr/>
+        <w:spacing/>
+        <w:ind/>
+        <w:rPr/>
+      </w:pPr>
+      <w:r>
+        <w:rPr>
+          <w:highlight w:val="none"/>
+        </w:rPr>
+        <w:t xml:space="preserve">Enter Subject ID: 2</w:t>
+      </w:r>
+      <w:r/>
+    </w:p>
+    <w:p>
+      <w:pPr>
+        <w:pBdr/>
+        <w:spacing/>
+        <w:ind/>
+        <w:rPr/>
+      </w:pPr>
+      <w:r>
+        <w:rPr>
+          <w:highlight w:val="none"/>
+        </w:rPr>
+      </w:r>
+      <w:r/>
+    </w:p>
+    <w:p>
+      <w:pPr>
+        <w:pBdr/>
+        <w:spacing/>
+        <w:ind/>
+        <w:rPr/>
+      </w:pPr>
+      <w:r>
+        <w:rPr>
+          <w:highlight w:val="none"/>
+        </w:rPr>
+        <w:t xml:space="preserve">Enter New Marks: 95</w:t>
+      </w:r>
+      <w:r/>
+    </w:p>
+    <w:p>
+      <w:pPr>
+        <w:pBdr/>
+        <w:spacing/>
+        <w:ind/>
+        <w:rPr/>
+      </w:pPr>
+      <w:r>
+        <w:rPr>
+          <w:highlight w:val="none"/>
+        </w:rPr>
+        <w:t xml:space="preserve">Subject ID</w:t>
+      </w:r>
+      <w:r/>
+    </w:p>
+    <w:p>
+      <w:pPr>
+        <w:pBdr/>
+        <w:spacing/>
+        <w:ind/>
+        <w:rPr/>
+      </w:pPr>
+      <w:r>
+        <w:rPr>
+          <w:highlight w:val="none"/>
+        </w:rPr>
+        <w:t xml:space="preserve">1. Mathematics</w:t>
+      </w:r>
+      <w:r/>
+    </w:p>
+    <w:p>
+      <w:pPr>
+        <w:pBdr/>
+        <w:spacing/>
+        <w:ind/>
+        <w:rPr/>
+      </w:pPr>
+      <w:r>
+        <w:rPr>
+          <w:highlight w:val="none"/>
+        </w:rPr>
+        <w:t xml:space="preserve">2. Chemistry</w:t>
+      </w:r>
+      <w:r/>
+    </w:p>
+    <w:p>
+      <w:pPr>
+        <w:pBdr/>
+        <w:spacing/>
+        <w:ind/>
+        <w:rPr/>
+      </w:pPr>
+      <w:r>
+        <w:rPr>
+          <w:highlight w:val="none"/>
+        </w:rPr>
+        <w:t xml:space="preserve">3.Physics</w:t>
+      </w:r>
+      <w:r/>
+    </w:p>
+    <w:p>
+      <w:pPr>
+        <w:pBdr/>
+        <w:spacing/>
+        <w:ind/>
+        <w:rPr/>
+      </w:pPr>
+      <w:r>
+        <w:rPr>
+          <w:highlight w:val="none"/>
+        </w:rPr>
+      </w:r>
+      <w:r/>
+    </w:p>
+    <w:p>
+      <w:pPr>
+        <w:pBdr/>
+        <w:spacing/>
+        <w:ind/>
+        <w:rPr/>
+      </w:pPr>
+      <w:r>
+        <w:rPr>
+          <w:highlight w:val="none"/>
+        </w:rPr>
+        <w:t xml:space="preserve">------------------Menu---------------------</w:t>
+      </w:r>
+      <w:r/>
+    </w:p>
+    <w:p>
+      <w:pPr>
+        <w:pBdr/>
+        <w:spacing/>
+        <w:ind/>
+        <w:rPr/>
+      </w:pPr>
+      <w:r>
+        <w:rPr>
+          <w:highlight w:val="none"/>
+        </w:rPr>
+        <w:t xml:space="preserve">1. Add Marks of Student</w:t>
+      </w:r>
+      <w:r/>
+    </w:p>
+    <w:p>
+      <w:pPr>
+        <w:pBdr/>
+        <w:spacing/>
+        <w:ind/>
+        <w:rPr/>
+      </w:pPr>
+      <w:r>
+        <w:rPr>
+          <w:highlight w:val="none"/>
+        </w:rPr>
+        <w:t xml:space="preserve">2. Update Marks of Student</w:t>
+      </w:r>
+      <w:r/>
+    </w:p>
+    <w:p>
+      <w:pPr>
+        <w:pBdr/>
+        <w:spacing/>
+        <w:ind/>
+        <w:rPr/>
+      </w:pPr>
+      <w:r>
+        <w:rPr>
+          <w:highlight w:val="none"/>
+        </w:rPr>
+        <w:t xml:space="preserve">3. Get Average of a Subject</w:t>
+      </w:r>
+      <w:r/>
+    </w:p>
+    <w:p>
+      <w:pPr>
+        <w:pBdr/>
+        <w:spacing/>
+        <w:ind/>
+        <w:rPr/>
+      </w:pPr>
+      <w:r>
+        <w:rPr>
+          <w:highlight w:val="none"/>
+        </w:rPr>
+        <w:t xml:space="preserve">4. Get Average of Student</w:t>
+      </w:r>
+      <w:r/>
+    </w:p>
+    <w:p>
+      <w:pPr>
+        <w:pBdr/>
+        <w:spacing/>
+        <w:ind/>
+        <w:rPr/>
+      </w:pPr>
+      <w:r>
+        <w:rPr>
+          <w:highlight w:val="none"/>
+        </w:rPr>
+        <w:t xml:space="preserve">5. Get total marks of Student</w:t>
+      </w:r>
+      <w:r/>
+    </w:p>
+    <w:p>
+      <w:pPr>
+        <w:pBdr/>
+        <w:spacing/>
+        <w:ind/>
+        <w:rPr/>
+      </w:pPr>
+      <w:r>
+        <w:rPr>
+          <w:highlight w:val="none"/>
+        </w:rPr>
+        <w:t xml:space="preserve">6. Exit</w:t>
+      </w:r>
+      <w:r/>
+    </w:p>
+    <w:p>
+      <w:pPr>
+        <w:pBdr/>
+        <w:spacing/>
+        <w:ind/>
+        <w:rPr/>
+      </w:pPr>
+      <w:r>
+        <w:rPr>
+          <w:highlight w:val="none"/>
+        </w:rPr>
+      </w:r>
+      <w:r/>
+    </w:p>
+    <w:p>
+      <w:pPr>
+        <w:pBdr/>
+        <w:spacing/>
+        <w:ind/>
+        <w:rPr/>
+      </w:pPr>
+      <w:r>
+        <w:rPr>
+          <w:highlight w:val="none"/>
+        </w:rPr>
+        <w:t xml:space="preserve">Enter your choice: 4</w:t>
+      </w:r>
+      <w:r/>
+    </w:p>
+    <w:p>
+      <w:pPr>
+        <w:pBdr/>
+        <w:spacing/>
+        <w:ind/>
+        <w:rPr/>
+      </w:pPr>
+      <w:r>
+        <w:rPr>
+          <w:highlight w:val="none"/>
+        </w:rPr>
+      </w:r>
+      <w:r/>
+    </w:p>
+    <w:p>
+      <w:pPr>
+        <w:pBdr/>
+        <w:spacing/>
+        <w:ind/>
+        <w:rPr/>
+      </w:pPr>
+      <w:r>
+        <w:rPr>
+          <w:highlight w:val="none"/>
+        </w:rPr>
+        <w:t xml:space="preserve">Enter the Student's ID, you want to find the average of: 2</w:t>
+      </w:r>
+      <w:r/>
+    </w:p>
+    <w:p>
+      <w:pPr>
+        <w:pBdr/>
+        <w:spacing/>
+        <w:ind/>
+        <w:rPr/>
+      </w:pPr>
+      <w:r>
+        <w:rPr>
+          <w:highlight w:val="none"/>
+        </w:rPr>
+      </w:r>
+      <w:r/>
+    </w:p>
+    <w:p>
+      <w:pPr>
+        <w:pBdr/>
+        <w:spacing/>
+        <w:ind/>
+        <w:rPr>
+          <w:highlight w:val="none"/>
+        </w:rPr>
+      </w:pPr>
+      <w:r>
+        <w:rPr>
+          <w:highlight w:val="none"/>
+        </w:rPr>
+        <w:t xml:space="preserve">Average of student 2 is 91.00</w:t>
+      </w:r>
+      <w:r>
+        <w:rPr>
+          <w:highlight w:val="none"/>
+        </w:rPr>
+      </w:r>
+    </w:p>
+    <w:p>
+      <w:pPr>
+        <w:pBdr/>
+        <w:spacing/>
+        <w:ind/>
+        <w:rPr>
+          <w:highlight w:val="none"/>
+        </w:rPr>
+      </w:pPr>
+      <w:r>
+        <w:rPr>
+          <w:highlight w:val="none"/>
+        </w:rPr>
+      </w:r>
+      <w:r>
+        <w:rPr>
+          <w:highlight w:val="none"/>
+        </w:rPr>
+      </w:r>
+      <w:r>
+        <w:rPr>
+          <w:highlight w:val="none"/>
+        </w:rPr>
+      </w:r>
+    </w:p>
+    <w:p>
+      <w:pPr>
+        <w:pBdr/>
+        <w:spacing/>
+        <w:ind/>
+        <w:rPr/>
+      </w:pPr>
+      <w:r>
+        <w:rPr>
+          <w:highlight w:val="none"/>
+        </w:rPr>
+        <w:t xml:space="preserve">Subject ID</w:t>
+      </w:r>
+      <w:r/>
+    </w:p>
+    <w:p>
+      <w:pPr>
+        <w:pBdr/>
+        <w:spacing/>
+        <w:ind/>
+        <w:rPr/>
+      </w:pPr>
+      <w:r>
+        <w:rPr>
+          <w:highlight w:val="none"/>
+        </w:rPr>
+        <w:t xml:space="preserve">1. Mathematics</w:t>
+      </w:r>
+      <w:r/>
+    </w:p>
+    <w:p>
+      <w:pPr>
+        <w:pBdr/>
+        <w:spacing/>
+        <w:ind/>
+        <w:rPr/>
+      </w:pPr>
+      <w:r>
+        <w:rPr>
+          <w:highlight w:val="none"/>
+        </w:rPr>
+        <w:t xml:space="preserve">2. Chemistry</w:t>
+      </w:r>
+      <w:r/>
+    </w:p>
+    <w:p>
+      <w:pPr>
+        <w:pBdr/>
+        <w:spacing/>
+        <w:ind/>
+        <w:rPr/>
+      </w:pPr>
+      <w:r>
+        <w:rPr>
+          <w:highlight w:val="none"/>
+        </w:rPr>
+        <w:t xml:space="preserve">3.Physics</w:t>
+      </w:r>
+      <w:r/>
+    </w:p>
+    <w:p>
+      <w:pPr>
+        <w:pBdr/>
+        <w:spacing/>
+        <w:ind/>
+        <w:rPr/>
+      </w:pPr>
+      <w:r>
+        <w:rPr>
+          <w:highlight w:val="none"/>
+        </w:rPr>
+      </w:r>
+      <w:r/>
+    </w:p>
+    <w:p>
+      <w:pPr>
+        <w:pBdr/>
+        <w:spacing/>
+        <w:ind/>
+        <w:rPr/>
+      </w:pPr>
+      <w:r>
+        <w:rPr>
+          <w:highlight w:val="none"/>
+        </w:rPr>
+        <w:t xml:space="preserve">------------------Menu---------------------</w:t>
+      </w:r>
+      <w:r/>
+    </w:p>
+    <w:p>
+      <w:pPr>
+        <w:pBdr/>
+        <w:spacing/>
+        <w:ind/>
+        <w:rPr/>
+      </w:pPr>
+      <w:r>
+        <w:rPr>
+          <w:highlight w:val="none"/>
+        </w:rPr>
+        <w:t xml:space="preserve">1. Add Marks of Student</w:t>
+      </w:r>
+      <w:r/>
+    </w:p>
+    <w:p>
+      <w:pPr>
+        <w:pBdr/>
+        <w:spacing/>
+        <w:ind/>
+        <w:rPr/>
+      </w:pPr>
+      <w:r>
+        <w:rPr>
+          <w:highlight w:val="none"/>
+        </w:rPr>
+        <w:t xml:space="preserve">2. Update Marks of Student</w:t>
+      </w:r>
+      <w:r/>
+    </w:p>
+    <w:p>
+      <w:pPr>
+        <w:pBdr/>
+        <w:spacing/>
+        <w:ind/>
+        <w:rPr/>
+      </w:pPr>
+      <w:r>
+        <w:rPr>
+          <w:highlight w:val="none"/>
+        </w:rPr>
+        <w:t xml:space="preserve">3. Get Average of a Subject</w:t>
+      </w:r>
+      <w:r/>
+    </w:p>
+    <w:p>
+      <w:pPr>
+        <w:pBdr/>
+        <w:spacing/>
+        <w:ind/>
+        <w:rPr/>
+      </w:pPr>
+      <w:r>
+        <w:rPr>
+          <w:highlight w:val="none"/>
+        </w:rPr>
+        <w:t xml:space="preserve">4. Get Average of Student</w:t>
+      </w:r>
+      <w:r/>
+    </w:p>
+    <w:p>
+      <w:pPr>
+        <w:pBdr/>
+        <w:spacing/>
+        <w:ind/>
+        <w:rPr/>
+      </w:pPr>
+      <w:r>
+        <w:rPr>
+          <w:highlight w:val="none"/>
+        </w:rPr>
+        <w:t xml:space="preserve">5. Get total marks of Student</w:t>
+      </w:r>
+      <w:r/>
+    </w:p>
+    <w:p>
+      <w:pPr>
+        <w:pBdr/>
+        <w:spacing/>
+        <w:ind/>
+        <w:rPr/>
+      </w:pPr>
+      <w:r>
+        <w:rPr>
+          <w:highlight w:val="none"/>
+        </w:rPr>
+        <w:t xml:space="preserve">6. Exit</w:t>
+      </w:r>
+      <w:r/>
+    </w:p>
+    <w:p>
+      <w:pPr>
+        <w:pBdr/>
+        <w:spacing/>
+        <w:ind/>
+        <w:rPr/>
+      </w:pPr>
+      <w:r>
+        <w:rPr>
+          <w:highlight w:val="none"/>
+        </w:rPr>
+      </w:r>
+      <w:r/>
+    </w:p>
+    <w:p>
+      <w:pPr>
+        <w:pBdr/>
+        <w:spacing/>
+        <w:ind/>
+        <w:rPr>
+          <w:highlight w:val="none"/>
+        </w:rPr>
+      </w:pPr>
+      <w:r>
+        <w:rPr>
+          <w:highlight w:val="none"/>
+        </w:rPr>
+        <w:t xml:space="preserve">Enter your choice: 6</w:t>
+      </w:r>
+      <w:r/>
+      <w:r>
+        <w:rPr>
+          <w:highlight w:val="none"/>
+        </w:rPr>
+      </w:r>
+      <w:r>
+        <w:rPr>
+          <w:highlight w:val="none"/>
+        </w:rPr>
+      </w:r>
+      <w:r/>
+    </w:p>
+    <w:p>
+      <w:pPr>
+        <w:pBdr/>
+        <w:spacing/>
+        <w:ind/>
+        <w:rPr/>
+      </w:pPr>
+      <w:r/>
+      <w:r/>
+      <w:r/>
+    </w:p>
+    <w:p>
+      <w:pPr>
+        <w:pBdr/>
+        <w:spacing/>
+        <w:ind/>
+        <w:rPr>
+          <w:b/>
+          <w:bCs/>
+          <w:sz w:val="28"/>
+          <w:szCs w:val="28"/>
+          <w:highlight w:val="none"/>
+        </w:rPr>
+      </w:pPr>
+      <w:r>
+        <w:rPr>
+          <w:b/>
+          <w:bCs/>
+          <w:sz w:val="28"/>
+          <w:szCs w:val="28"/>
+          <w:highlight w:val="none"/>
+        </w:rPr>
+        <w:t xml:space="preserve">Exercise 3</w:t>
+      </w:r>
+      <w:r>
+        <w:rPr>
+          <w:b/>
+          <w:bCs/>
+          <w:sz w:val="28"/>
+          <w:szCs w:val="28"/>
+        </w:rPr>
+      </w:r>
+    </w:p>
+    <w:p>
+      <w:pPr>
+        <w:pBdr/>
+        <w:spacing/>
+        <w:ind/>
+        <w:rPr/>
+      </w:pPr>
+      <w:r>
+        <w:rPr>
+          <w:highlight w:val="none"/>
+        </w:rPr>
+        <w:t xml:space="preserve"> case 6: // Display Grades Summary</w:t>
+      </w:r>
+      <w:r/>
+    </w:p>
+    <w:p>
+      <w:pPr>
+        <w:pBdr/>
+        <w:spacing/>
+        <w:ind/>
+        <w:rPr/>
+      </w:pPr>
+      <w:r>
+        <w:rPr>
+          <w:highlight w:val="none"/>
+        </w:rPr>
+        <w:t xml:space="preserve">                    System.out.println("\n----------------- Grade Summary -----------------");</w:t>
+      </w:r>
+      <w:r/>
+    </w:p>
+    <w:p>
+      <w:pPr>
+        <w:pBdr/>
+        <w:spacing/>
+        <w:ind/>
+        <w:rPr/>
+      </w:pPr>
+      <w:r>
+        <w:rPr>
+          <w:highlight w:val="none"/>
+        </w:rPr>
+        <w:t xml:space="preserve">                    System.out.printf("%-12s %-12s %-12s %-12s\n", "Student ID", "Math", "Chemistry", "Physics");</w:t>
+      </w:r>
+      <w:r/>
+    </w:p>
+    <w:p>
+      <w:pPr>
+        <w:pBdr/>
+        <w:spacing/>
+        <w:ind/>
+        <w:rPr/>
+      </w:pPr>
+      <w:r>
+        <w:rPr>
+          <w:highlight w:val="none"/>
+        </w:rPr>
+        <w:t xml:space="preserve">                    System.out.println("-------------------------------------------------");</w:t>
+      </w:r>
+      <w:r/>
+    </w:p>
+    <w:p>
+      <w:pPr>
+        <w:pBdr/>
+        <w:spacing/>
+        <w:ind/>
+        <w:rPr/>
+      </w:pPr>
+      <w:r>
+        <w:rPr>
+          <w:highlight w:val="none"/>
+        </w:rPr>
+      </w:r>
+      <w:r/>
+    </w:p>
+    <w:p>
+      <w:pPr>
+        <w:pBdr/>
+        <w:spacing/>
+        <w:ind/>
+        <w:rPr/>
+      </w:pPr>
+      <w:r>
+        <w:rPr>
+          <w:highlight w:val="none"/>
+        </w:rPr>
+        <w:t xml:space="preserve">                    for (int s = 0; s &lt; num_of_students; s++) {</w:t>
+      </w:r>
+      <w:r/>
+    </w:p>
+    <w:p>
+      <w:pPr>
+        <w:pBdr/>
+        <w:spacing/>
+        <w:ind/>
+        <w:rPr/>
+      </w:pPr>
+      <w:r>
+        <w:rPr>
+          <w:highlight w:val="none"/>
+        </w:rPr>
+        <w:t xml:space="preserve">                        System.out.printf("%-12d ", s + 1);</w:t>
+      </w:r>
+      <w:r/>
+    </w:p>
+    <w:p>
+      <w:pPr>
+        <w:pBdr/>
+        <w:spacing/>
+        <w:ind/>
+        <w:rPr/>
+      </w:pPr>
+      <w:r>
+        <w:rPr>
+          <w:highlight w:val="none"/>
+        </w:rPr>
+      </w:r>
+      <w:r/>
+    </w:p>
+    <w:p>
+      <w:pPr>
+        <w:pBdr/>
+        <w:spacing/>
+        <w:ind/>
+        <w:rPr/>
+      </w:pPr>
+      <w:r>
+        <w:rPr>
+          <w:highlight w:val="none"/>
+        </w:rPr>
+        <w:t xml:space="preserve">                        for (int sub = 0; sub &lt; 3; sub++) {</w:t>
+      </w:r>
+      <w:r/>
+    </w:p>
+    <w:p>
+      <w:pPr>
+        <w:pBdr/>
+        <w:spacing/>
+        <w:ind/>
+        <w:rPr/>
+      </w:pPr>
+      <w:r>
+        <w:rPr>
+          <w:highlight w:val="none"/>
+        </w:rPr>
+        <w:t xml:space="preserve">                            int score = marks_array[s][sub];</w:t>
+      </w:r>
+      <w:r/>
+    </w:p>
+    <w:p>
+      <w:pPr>
+        <w:pBdr/>
+        <w:spacing/>
+        <w:ind/>
+        <w:rPr/>
+      </w:pPr>
+      <w:r>
+        <w:rPr>
+          <w:highlight w:val="none"/>
+        </w:rPr>
+        <w:t xml:space="preserve">                            String grade;</w:t>
+      </w:r>
+      <w:r/>
+    </w:p>
+    <w:p>
+      <w:pPr>
+        <w:pBdr/>
+        <w:spacing/>
+        <w:ind/>
+        <w:rPr/>
+      </w:pPr>
+      <w:r>
+        <w:rPr>
+          <w:highlight w:val="none"/>
+        </w:rPr>
+      </w:r>
+      <w:r/>
+    </w:p>
+    <w:p>
+      <w:pPr>
+        <w:pBdr/>
+        <w:spacing/>
+        <w:ind/>
+        <w:rPr/>
+      </w:pPr>
+      <w:r>
+        <w:rPr>
+          <w:highlight w:val="none"/>
+        </w:rPr>
+        <w:t xml:space="preserve">                            if (score &gt;= 90) {</w:t>
+      </w:r>
+      <w:r/>
+    </w:p>
+    <w:p>
+      <w:pPr>
+        <w:pBdr/>
+        <w:spacing/>
+        <w:ind/>
+        <w:rPr/>
+      </w:pPr>
+      <w:r>
+        <w:rPr>
+          <w:highlight w:val="none"/>
+        </w:rPr>
+        <w:t xml:space="preserve">                                grade = "Grade A";</w:t>
+      </w:r>
+      <w:r/>
+    </w:p>
+    <w:p>
+      <w:pPr>
+        <w:pBdr/>
+        <w:spacing/>
+        <w:ind/>
+        <w:rPr/>
+      </w:pPr>
+      <w:r>
+        <w:rPr>
+          <w:highlight w:val="none"/>
+        </w:rPr>
+        <w:t xml:space="preserve">                            } else if (score &gt;= 80) {</w:t>
+      </w:r>
+      <w:r/>
+    </w:p>
+    <w:p>
+      <w:pPr>
+        <w:pBdr/>
+        <w:spacing/>
+        <w:ind/>
+        <w:rPr/>
+      </w:pPr>
+      <w:r>
+        <w:rPr>
+          <w:highlight w:val="none"/>
+        </w:rPr>
+        <w:t xml:space="preserve">                                grade = "Grade B";</w:t>
+      </w:r>
+      <w:r/>
+    </w:p>
+    <w:p>
+      <w:pPr>
+        <w:pBdr/>
+        <w:spacing/>
+        <w:ind/>
+        <w:rPr/>
+      </w:pPr>
+      <w:r>
+        <w:rPr>
+          <w:highlight w:val="none"/>
+        </w:rPr>
+        <w:t xml:space="preserve">                            } else if (score &gt;= 70) {</w:t>
+      </w:r>
+      <w:r/>
+    </w:p>
+    <w:p>
+      <w:pPr>
+        <w:pBdr/>
+        <w:spacing/>
+        <w:ind/>
+        <w:rPr/>
+      </w:pPr>
+      <w:r>
+        <w:rPr>
+          <w:highlight w:val="none"/>
+        </w:rPr>
+        <w:t xml:space="preserve">                                grade = "Grade C";</w:t>
+      </w:r>
+      <w:r/>
+    </w:p>
+    <w:p>
+      <w:pPr>
+        <w:pBdr/>
+        <w:spacing/>
+        <w:ind/>
+        <w:rPr/>
+      </w:pPr>
+      <w:r>
+        <w:rPr>
+          <w:highlight w:val="none"/>
+        </w:rPr>
+        <w:t xml:space="preserve">                            } else if (score &gt;= 60) {</w:t>
+      </w:r>
+      <w:r/>
+    </w:p>
+    <w:p>
+      <w:pPr>
+        <w:pBdr/>
+        <w:spacing/>
+        <w:ind/>
+        <w:rPr/>
+      </w:pPr>
+      <w:r>
+        <w:rPr>
+          <w:highlight w:val="none"/>
+        </w:rPr>
+        <w:t xml:space="preserve">                                grade = "Grade D";</w:t>
+      </w:r>
+      <w:r/>
+    </w:p>
+    <w:p>
+      <w:pPr>
+        <w:pBdr/>
+        <w:spacing/>
+        <w:ind/>
+        <w:rPr/>
+      </w:pPr>
+      <w:r>
+        <w:rPr>
+          <w:highlight w:val="none"/>
+        </w:rPr>
+        <w:t xml:space="preserve">                            } else {</w:t>
+      </w:r>
+      <w:r/>
+    </w:p>
+    <w:p>
+      <w:pPr>
+        <w:pBdr/>
+        <w:spacing/>
+        <w:ind/>
+        <w:rPr/>
+      </w:pPr>
+      <w:r>
+        <w:rPr>
+          <w:highlight w:val="none"/>
+        </w:rPr>
+        <w:t xml:space="preserve">                                grade = "Fail";</w:t>
+      </w:r>
+      <w:r/>
+    </w:p>
+    <w:p>
+      <w:pPr>
+        <w:pBdr/>
+        <w:spacing/>
+        <w:ind/>
+        <w:rPr/>
+      </w:pPr>
+      <w:r>
+        <w:rPr>
+          <w:highlight w:val="none"/>
+        </w:rPr>
+        <w:t xml:space="preserve">                            }</w:t>
+      </w:r>
+      <w:r/>
+    </w:p>
+    <w:p>
+      <w:pPr>
+        <w:pBdr/>
+        <w:spacing/>
+        <w:ind/>
+        <w:rPr/>
+      </w:pPr>
+      <w:r>
+        <w:rPr>
+          <w:highlight w:val="none"/>
+        </w:rPr>
+      </w:r>
+      <w:r/>
+    </w:p>
+    <w:p>
+      <w:pPr>
+        <w:pBdr/>
+        <w:spacing/>
+        <w:ind/>
+        <w:rPr/>
+      </w:pPr>
+      <w:r>
+        <w:rPr>
+          <w:highlight w:val="none"/>
+        </w:rPr>
+        <w:t xml:space="preserve">                            System.out.printf("%-12s \n", grade);</w:t>
+      </w:r>
+      <w:r/>
+    </w:p>
+    <w:p>
+      <w:pPr>
+        <w:pBdr/>
+        <w:spacing/>
+        <w:ind/>
+        <w:rPr/>
+      </w:pPr>
+      <w:r>
+        <w:rPr>
+          <w:highlight w:val="none"/>
+        </w:rPr>
+        <w:t xml:space="preserve">                        }</w:t>
+      </w:r>
+      <w:r/>
+    </w:p>
+    <w:p>
+      <w:pPr>
+        <w:pBdr/>
+        <w:spacing/>
+        <w:ind/>
+        <w:rPr/>
+      </w:pPr>
+      <w:r>
+        <w:rPr>
+          <w:highlight w:val="none"/>
+        </w:rPr>
+        <w:t xml:space="preserve">                        System.out.println(); // Move to next student line</w:t>
+      </w:r>
+      <w:r/>
+    </w:p>
+    <w:p>
+      <w:pPr>
+        <w:pBdr/>
+        <w:spacing/>
+        <w:ind/>
+        <w:rPr/>
+      </w:pPr>
+      <w:r>
+        <w:rPr>
+          <w:highlight w:val="none"/>
+        </w:rPr>
+        <w:t xml:space="preserve">                    }</w:t>
+      </w:r>
+      <w:r/>
+    </w:p>
+    <w:p>
+      <w:pPr>
+        <w:pBdr/>
+        <w:spacing/>
+        <w:ind/>
+        <w:rPr>
+          <w:highlight w:val="none"/>
+        </w:rPr>
+      </w:pPr>
+      <w:r>
+        <w:rPr>
+          <w:highlight w:val="none"/>
+        </w:rPr>
+        <w:t xml:space="preserve">                    break;</w:t>
+      </w:r>
+      <w:r/>
+      <w:r>
+        <w:rPr>
+          <w:highlight w:val="none"/>
+        </w:rPr>
+      </w:r>
+      <w:r/>
+    </w:p>
+    <w:p>
+      <w:pPr>
+        <w:pBdr/>
+        <w:spacing/>
+        <w:ind/>
+        <w:rPr/>
+      </w:pPr>
+      <w:r/>
+      <w:r/>
+      <w:r/>
+    </w:p>
+    <w:p>
+      <w:pPr>
+        <w:pBdr/>
+        <w:spacing/>
+        <w:ind/>
+        <w:rPr>
+          <w:b/>
+          <w:bCs/>
+          <w:sz w:val="28"/>
+          <w:szCs w:val="28"/>
+          <w:highlight w:val="none"/>
+        </w:rPr>
+      </w:pPr>
+      <w:r>
+        <w:rPr>
+          <w:b/>
+          <w:bCs/>
+          <w:sz w:val="28"/>
+          <w:szCs w:val="28"/>
+          <w:highlight w:val="none"/>
+        </w:rPr>
+        <w:t xml:space="preserve">Output</w:t>
+      </w:r>
+      <w:r>
+        <w:rPr>
+          <w:b/>
+          <w:bCs/>
+          <w:sz w:val="28"/>
+          <w:szCs w:val="28"/>
+        </w:rPr>
+      </w:r>
+    </w:p>
+    <w:p>
+      <w:pPr>
+        <w:pBdr/>
+        <w:spacing/>
+        <w:ind/>
+        <w:rPr/>
+      </w:pPr>
+      <w:r>
+        <w:rPr>
+          <w:highlight w:val="none"/>
+        </w:rPr>
+        <w:t xml:space="preserve">Enter number of students: 1</w:t>
+      </w:r>
+      <w:r/>
+    </w:p>
+    <w:p>
+      <w:pPr>
+        <w:pBdr/>
+        <w:spacing/>
+        <w:ind/>
+        <w:rPr/>
+      </w:pPr>
+      <w:r>
+        <w:rPr>
+          <w:highlight w:val="none"/>
+        </w:rPr>
+      </w:r>
+      <w:r/>
+    </w:p>
+    <w:p>
+      <w:pPr>
+        <w:pBdr/>
+        <w:spacing/>
+        <w:ind/>
+        <w:rPr/>
+      </w:pPr>
+      <w:r>
+        <w:rPr>
+          <w:highlight w:val="none"/>
+        </w:rPr>
+        <w:t xml:space="preserve">Subject ID</w:t>
+      </w:r>
+      <w:r/>
+    </w:p>
+    <w:p>
+      <w:pPr>
+        <w:pBdr/>
+        <w:spacing/>
+        <w:ind/>
+        <w:rPr/>
+      </w:pPr>
+      <w:r>
+        <w:rPr>
+          <w:highlight w:val="none"/>
+        </w:rPr>
+        <w:t xml:space="preserve">1. Mathematics</w:t>
+      </w:r>
+      <w:r/>
+    </w:p>
+    <w:p>
+      <w:pPr>
+        <w:pBdr/>
+        <w:spacing/>
+        <w:ind/>
+        <w:rPr/>
+      </w:pPr>
+      <w:r>
+        <w:rPr>
+          <w:highlight w:val="none"/>
+        </w:rPr>
+        <w:t xml:space="preserve">2. Chemistry</w:t>
+      </w:r>
+      <w:r/>
+    </w:p>
+    <w:p>
+      <w:pPr>
+        <w:pBdr/>
+        <w:spacing/>
+        <w:ind/>
+        <w:rPr/>
+      </w:pPr>
+      <w:r>
+        <w:rPr>
+          <w:highlight w:val="none"/>
+        </w:rPr>
+        <w:t xml:space="preserve">3.Physics</w:t>
+      </w:r>
+      <w:r/>
+    </w:p>
+    <w:p>
+      <w:pPr>
+        <w:pBdr/>
+        <w:spacing/>
+        <w:ind/>
+        <w:rPr/>
+      </w:pPr>
+      <w:r>
+        <w:rPr>
+          <w:highlight w:val="none"/>
+        </w:rPr>
+      </w:r>
+      <w:r/>
+    </w:p>
+    <w:p>
+      <w:pPr>
+        <w:pBdr/>
+        <w:spacing/>
+        <w:ind/>
+        <w:rPr/>
+      </w:pPr>
+      <w:r>
+        <w:rPr>
+          <w:highlight w:val="none"/>
+        </w:rPr>
+        <w:t xml:space="preserve">------------------Menu---------------------</w:t>
+      </w:r>
+      <w:r/>
+    </w:p>
+    <w:p>
+      <w:pPr>
+        <w:pBdr/>
+        <w:spacing/>
+        <w:ind/>
+        <w:rPr/>
+      </w:pPr>
+      <w:r>
+        <w:rPr>
+          <w:highlight w:val="none"/>
+        </w:rPr>
+        <w:t xml:space="preserve">1. Add Marks of Student</w:t>
+      </w:r>
+      <w:r/>
+    </w:p>
+    <w:p>
+      <w:pPr>
+        <w:pBdr/>
+        <w:spacing/>
+        <w:ind/>
+        <w:rPr/>
+      </w:pPr>
+      <w:r>
+        <w:rPr>
+          <w:highlight w:val="none"/>
+        </w:rPr>
+        <w:t xml:space="preserve">2. Update Marks of Student</w:t>
+      </w:r>
+      <w:r/>
+    </w:p>
+    <w:p>
+      <w:pPr>
+        <w:pBdr/>
+        <w:spacing/>
+        <w:ind/>
+        <w:rPr/>
+      </w:pPr>
+      <w:r>
+        <w:rPr>
+          <w:highlight w:val="none"/>
+        </w:rPr>
+        <w:t xml:space="preserve">3. Get Average of a Subject</w:t>
+      </w:r>
+      <w:r/>
+    </w:p>
+    <w:p>
+      <w:pPr>
+        <w:pBdr/>
+        <w:spacing/>
+        <w:ind/>
+        <w:rPr/>
+      </w:pPr>
+      <w:r>
+        <w:rPr>
+          <w:highlight w:val="none"/>
+        </w:rPr>
+        <w:t xml:space="preserve">4. Get Average of Student</w:t>
+      </w:r>
+      <w:r/>
+    </w:p>
+    <w:p>
+      <w:pPr>
+        <w:pBdr/>
+        <w:spacing/>
+        <w:ind/>
+        <w:rPr/>
+      </w:pPr>
+      <w:r>
+        <w:rPr>
+          <w:highlight w:val="none"/>
+        </w:rPr>
+        <w:t xml:space="preserve">5. Get total marks of Student</w:t>
+      </w:r>
+      <w:r/>
+    </w:p>
+    <w:p>
+      <w:pPr>
+        <w:pBdr/>
+        <w:spacing/>
+        <w:ind/>
+        <w:rPr/>
+      </w:pPr>
+      <w:r>
+        <w:rPr>
+          <w:highlight w:val="none"/>
+        </w:rPr>
+        <w:t xml:space="preserve">6. Table of Students and marks</w:t>
+      </w:r>
+      <w:r/>
+    </w:p>
+    <w:p>
+      <w:pPr>
+        <w:pBdr/>
+        <w:spacing/>
+        <w:ind/>
+        <w:rPr/>
+      </w:pPr>
+      <w:r>
+        <w:rPr>
+          <w:highlight w:val="none"/>
+        </w:rPr>
+        <w:t xml:space="preserve">7. Exit</w:t>
+      </w:r>
+      <w:r/>
+    </w:p>
+    <w:p>
+      <w:pPr>
+        <w:pBdr/>
+        <w:spacing/>
+        <w:ind/>
+        <w:rPr/>
+      </w:pPr>
+      <w:r>
+        <w:rPr>
+          <w:highlight w:val="none"/>
+        </w:rPr>
+      </w:r>
+      <w:r/>
+    </w:p>
+    <w:p>
+      <w:pPr>
+        <w:pBdr/>
+        <w:spacing/>
+        <w:ind/>
+        <w:rPr/>
+      </w:pPr>
+      <w:r>
+        <w:rPr>
+          <w:highlight w:val="none"/>
+        </w:rPr>
+        <w:t xml:space="preserve">Enter your choice: 1</w:t>
+      </w:r>
+      <w:r/>
+    </w:p>
+    <w:p>
+      <w:pPr>
+        <w:pBdr/>
+        <w:spacing/>
+        <w:ind/>
+        <w:rPr/>
+      </w:pPr>
+      <w:r>
+        <w:rPr>
+          <w:highlight w:val="none"/>
+        </w:rPr>
+      </w:r>
+      <w:r/>
+    </w:p>
+    <w:p>
+      <w:pPr>
+        <w:pBdr/>
+        <w:spacing/>
+        <w:ind/>
+        <w:rPr/>
+      </w:pPr>
+      <w:r>
+        <w:rPr>
+          <w:highlight w:val="none"/>
+        </w:rPr>
+        <w:t xml:space="preserve">Enter Student ID: 1</w:t>
+      </w:r>
+      <w:r/>
+    </w:p>
+    <w:p>
+      <w:pPr>
+        <w:pBdr/>
+        <w:spacing/>
+        <w:ind/>
+        <w:rPr/>
+      </w:pPr>
+      <w:r>
+        <w:rPr>
+          <w:highlight w:val="none"/>
+        </w:rPr>
+      </w:r>
+      <w:r/>
+    </w:p>
+    <w:p>
+      <w:pPr>
+        <w:pBdr/>
+        <w:spacing/>
+        <w:ind/>
+        <w:rPr/>
+      </w:pPr>
+      <w:r>
+        <w:rPr>
+          <w:highlight w:val="none"/>
+        </w:rPr>
+        <w:t xml:space="preserve">Enter Marks for Mathematics: 56</w:t>
+      </w:r>
+      <w:r/>
+    </w:p>
+    <w:p>
+      <w:pPr>
+        <w:pBdr/>
+        <w:spacing/>
+        <w:ind/>
+        <w:rPr/>
+      </w:pPr>
+      <w:r>
+        <w:rPr>
+          <w:highlight w:val="none"/>
+        </w:rPr>
+      </w:r>
+      <w:r/>
+    </w:p>
+    <w:p>
+      <w:pPr>
+        <w:pBdr/>
+        <w:spacing/>
+        <w:ind/>
+        <w:rPr/>
+      </w:pPr>
+      <w:r>
+        <w:rPr>
+          <w:highlight w:val="none"/>
+        </w:rPr>
+        <w:t xml:space="preserve">Enter Marks for Chemistry: 67</w:t>
+      </w:r>
+      <w:r/>
+    </w:p>
+    <w:p>
+      <w:pPr>
+        <w:pBdr/>
+        <w:spacing/>
+        <w:ind/>
+        <w:rPr/>
+      </w:pPr>
+      <w:r>
+        <w:rPr>
+          <w:highlight w:val="none"/>
+        </w:rPr>
+      </w:r>
+      <w:r/>
+    </w:p>
+    <w:p>
+      <w:pPr>
+        <w:pBdr/>
+        <w:spacing/>
+        <w:ind/>
+        <w:rPr/>
+      </w:pPr>
+      <w:r>
+        <w:rPr>
+          <w:highlight w:val="none"/>
+        </w:rPr>
+        <w:t xml:space="preserve">Enter Marks for Physics: 89</w:t>
+      </w:r>
+      <w:r/>
+    </w:p>
+    <w:p>
+      <w:pPr>
+        <w:pBdr/>
+        <w:spacing/>
+        <w:ind/>
+        <w:rPr/>
+      </w:pPr>
+      <w:r>
+        <w:rPr>
+          <w:highlight w:val="none"/>
+        </w:rPr>
+      </w:r>
+      <w:r/>
+    </w:p>
+    <w:p>
+      <w:pPr>
+        <w:pBdr/>
+        <w:spacing/>
+        <w:ind/>
+        <w:rPr/>
+      </w:pPr>
+      <w:r>
+        <w:rPr>
+          <w:highlight w:val="none"/>
+        </w:rPr>
+        <w:t xml:space="preserve">Subject ID</w:t>
+      </w:r>
+      <w:r/>
+    </w:p>
+    <w:p>
+      <w:pPr>
+        <w:pBdr/>
+        <w:spacing/>
+        <w:ind/>
+        <w:rPr/>
+      </w:pPr>
+      <w:r>
+        <w:rPr>
+          <w:highlight w:val="none"/>
+        </w:rPr>
+        <w:t xml:space="preserve">1. Mathematics</w:t>
+      </w:r>
+      <w:r/>
+    </w:p>
+    <w:p>
+      <w:pPr>
+        <w:pBdr/>
+        <w:spacing/>
+        <w:ind/>
+        <w:rPr/>
+      </w:pPr>
+      <w:r>
+        <w:rPr>
+          <w:highlight w:val="none"/>
+        </w:rPr>
+        <w:t xml:space="preserve">2. Chemistry</w:t>
+      </w:r>
+      <w:r/>
+    </w:p>
+    <w:p>
+      <w:pPr>
+        <w:pBdr/>
+        <w:spacing/>
+        <w:ind/>
+        <w:rPr/>
+      </w:pPr>
+      <w:r>
+        <w:rPr>
+          <w:highlight w:val="none"/>
+        </w:rPr>
+        <w:t xml:space="preserve">3.Physics</w:t>
+      </w:r>
+      <w:r/>
+    </w:p>
+    <w:p>
+      <w:pPr>
+        <w:pBdr/>
+        <w:spacing/>
+        <w:ind/>
+        <w:rPr/>
+      </w:pPr>
+      <w:r>
+        <w:rPr>
+          <w:highlight w:val="none"/>
+        </w:rPr>
+      </w:r>
+      <w:r/>
+    </w:p>
+    <w:p>
+      <w:pPr>
+        <w:pBdr/>
+        <w:spacing/>
+        <w:ind/>
+        <w:rPr/>
+      </w:pPr>
+      <w:r>
+        <w:rPr>
+          <w:highlight w:val="none"/>
+        </w:rPr>
+        <w:t xml:space="preserve">------------------Menu---------------------</w:t>
+      </w:r>
+      <w:r/>
+    </w:p>
+    <w:p>
+      <w:pPr>
+        <w:pBdr/>
+        <w:spacing/>
+        <w:ind/>
+        <w:rPr/>
+      </w:pPr>
+      <w:r>
+        <w:rPr>
+          <w:highlight w:val="none"/>
+        </w:rPr>
+        <w:t xml:space="preserve">1. Add Marks of Student</w:t>
+      </w:r>
+      <w:r/>
+    </w:p>
+    <w:p>
+      <w:pPr>
+        <w:pBdr/>
+        <w:spacing/>
+        <w:ind/>
+        <w:rPr/>
+      </w:pPr>
+      <w:r>
+        <w:rPr>
+          <w:highlight w:val="none"/>
+        </w:rPr>
+        <w:t xml:space="preserve">2. Update Marks of Student</w:t>
+      </w:r>
+      <w:r/>
+    </w:p>
+    <w:p>
+      <w:pPr>
+        <w:pBdr/>
+        <w:spacing/>
+        <w:ind/>
+        <w:rPr/>
+      </w:pPr>
+      <w:r>
+        <w:rPr>
+          <w:highlight w:val="none"/>
+        </w:rPr>
+        <w:t xml:space="preserve">3. Get Average of a Subject</w:t>
+      </w:r>
+      <w:r/>
+    </w:p>
+    <w:p>
+      <w:pPr>
+        <w:pBdr/>
+        <w:spacing/>
+        <w:ind/>
+        <w:rPr/>
+      </w:pPr>
+      <w:r>
+        <w:rPr>
+          <w:highlight w:val="none"/>
+        </w:rPr>
+        <w:t xml:space="preserve">4. Get Average of Student</w:t>
+      </w:r>
+      <w:r/>
+    </w:p>
+    <w:p>
+      <w:pPr>
+        <w:pBdr/>
+        <w:spacing/>
+        <w:ind/>
+        <w:rPr/>
+      </w:pPr>
+      <w:r>
+        <w:rPr>
+          <w:highlight w:val="none"/>
+        </w:rPr>
+        <w:t xml:space="preserve">5. Get total marks of Student</w:t>
+      </w:r>
+      <w:r/>
+    </w:p>
+    <w:p>
+      <w:pPr>
+        <w:pBdr/>
+        <w:spacing/>
+        <w:ind/>
+        <w:rPr/>
+      </w:pPr>
+      <w:r>
+        <w:rPr>
+          <w:highlight w:val="none"/>
+        </w:rPr>
+        <w:t xml:space="preserve">6. Table of Students and marks</w:t>
+      </w:r>
+      <w:r/>
+    </w:p>
+    <w:p>
+      <w:pPr>
+        <w:pBdr/>
+        <w:spacing/>
+        <w:ind/>
+        <w:rPr/>
+      </w:pPr>
+      <w:r>
+        <w:rPr>
+          <w:highlight w:val="none"/>
+        </w:rPr>
+        <w:t xml:space="preserve">7. Exit</w:t>
+      </w:r>
+      <w:r/>
+    </w:p>
+    <w:p>
+      <w:pPr>
+        <w:pBdr/>
+        <w:spacing/>
+        <w:ind/>
+        <w:rPr/>
+      </w:pPr>
+      <w:r>
+        <w:rPr>
+          <w:highlight w:val="none"/>
+        </w:rPr>
+      </w:r>
+      <w:r/>
+    </w:p>
+    <w:p>
+      <w:pPr>
+        <w:pBdr/>
+        <w:spacing/>
+        <w:ind/>
+        <w:rPr/>
+      </w:pPr>
+      <w:r>
+        <w:rPr>
+          <w:highlight w:val="none"/>
+        </w:rPr>
+        <w:t xml:space="preserve">Enter your choice: 6</w:t>
+      </w:r>
+      <w:r/>
+    </w:p>
+    <w:p>
+      <w:pPr>
+        <w:pBdr/>
+        <w:spacing/>
+        <w:ind/>
+        <w:rPr/>
+      </w:pPr>
+      <w:r>
+        <w:rPr>
+          <w:highlight w:val="none"/>
+        </w:rPr>
+      </w:r>
+      <w:r/>
+    </w:p>
+    <w:p>
+      <w:pPr>
+        <w:pBdr/>
+        <w:spacing/>
+        <w:ind/>
+        <w:rPr/>
+      </w:pPr>
+      <w:r>
+        <w:rPr>
+          <w:highlight w:val="none"/>
+        </w:rPr>
+        <w:t xml:space="preserve">----------------- Grade Summary -----------------</w:t>
+      </w:r>
+      <w:r/>
+    </w:p>
+    <w:p>
+      <w:pPr>
+        <w:pBdr/>
+        <w:spacing/>
+        <w:ind/>
+        <w:rPr/>
+      </w:pPr>
+      <w:r>
+        <w:rPr>
+          <w:highlight w:val="none"/>
+        </w:rPr>
+        <w:t xml:space="preserve">Student ID   Math         Chemistry    Physics</w:t>
+      </w:r>
+      <w:r/>
+    </w:p>
+    <w:p>
+      <w:pPr>
+        <w:pBdr/>
+        <w:spacing/>
+        <w:ind/>
+        <w:rPr/>
+      </w:pPr>
+      <w:r>
+        <w:rPr>
+          <w:highlight w:val="none"/>
+        </w:rPr>
+        <w:t xml:space="preserve">-------------------------------------------------</w:t>
+      </w:r>
+      <w:r/>
+    </w:p>
+    <w:p>
+      <w:pPr>
+        <w:pBdr/>
+        <w:spacing/>
+        <w:ind/>
+        <w:rPr/>
+      </w:pPr>
+      <w:r>
+        <w:rPr>
+          <w:highlight w:val="none"/>
+        </w:rPr>
+        <w:t xml:space="preserve">1            Fail         Grade D      Grade B</w:t>
       </w:r>
       <w:r/>
       <w:r>

</xml_diff>